<commit_message>
feat: create and edit item
</commit_message>
<xml_diff>
--- a/MyApp/hihi.docx
+++ b/MyApp/hihi.docx
@@ -124,6 +124,9 @@
     </w:p>
     <w:p>
       <w:r>
+        <w:rPr>
+          <w:noProof/>
+        </w:rPr>
         <w:lastRenderedPageBreak/>
         <w:drawing>
           <wp:inline distT="0" distB="0" distL="0" distR="0" wp14:anchorId="25F780B2" wp14:editId="4E2F3483">
@@ -164,6 +167,9 @@
     </w:p>
     <w:p>
       <w:r>
+        <w:rPr>
+          <w:noProof/>
+        </w:rPr>
         <w:drawing>
           <wp:inline distT="0" distB="0" distL="0" distR="0" wp14:anchorId="1ECC0E30" wp14:editId="6C248F22">
             <wp:extent cx="3494290" cy="5733057"/>
@@ -208,6 +214,9 @@
     </w:p>
     <w:p>
       <w:r>
+        <w:rPr>
+          <w:noProof/>
+        </w:rPr>
         <w:lastRenderedPageBreak/>
         <w:drawing>
           <wp:inline distT="0" distB="0" distL="0" distR="0" wp14:anchorId="49168284" wp14:editId="7F99D592">
@@ -248,6 +257,9 @@
     </w:p>
     <w:p>
       <w:r>
+        <w:rPr>
+          <w:noProof/>
+        </w:rPr>
         <w:drawing>
           <wp:inline distT="0" distB="0" distL="0" distR="0" wp14:anchorId="3979F289" wp14:editId="4EADC496">
             <wp:extent cx="5943600" cy="346710"/>
@@ -292,6 +304,9 @@
     </w:p>
     <w:p>
       <w:r>
+        <w:rPr>
+          <w:noProof/>
+        </w:rPr>
         <w:lastRenderedPageBreak/>
         <w:drawing>
           <wp:inline distT="0" distB="0" distL="0" distR="0" wp14:anchorId="4B95AD7B" wp14:editId="7B652A67">
@@ -332,6 +347,9 @@
     </w:p>
     <w:p>
       <w:r>
+        <w:rPr>
+          <w:noProof/>
+        </w:rPr>
         <w:drawing>
           <wp:inline distT="0" distB="0" distL="0" distR="0" wp14:anchorId="7F410F93" wp14:editId="607A8553">
             <wp:extent cx="5943600" cy="2277745"/>
@@ -371,6 +389,9 @@
     </w:p>
     <w:p>
       <w:r>
+        <w:rPr>
+          <w:noProof/>
+        </w:rPr>
         <w:drawing>
           <wp:inline distT="0" distB="0" distL="0" distR="0" wp14:anchorId="4D04A304" wp14:editId="2E84EE63">
             <wp:extent cx="5441766" cy="3966210"/>
@@ -718,7 +739,7 @@
     <w:p>
       <w:r>
         <w:pict w14:anchorId="37F0E96C">
-          <v:rect id="_x0000_i1085" style="width:0;height:1.5pt" o:hralign="center" o:hrstd="t" o:hr="t" fillcolor="#a0a0a0" stroked="f"/>
+          <v:rect id="_x0000_i1025" style="width:0;height:1.5pt" o:hralign="center" o:hrstd="t" o:hr="t" fillcolor="#a0a0a0" stroked="f"/>
         </w:pict>
       </w:r>
     </w:p>
@@ -907,7 +928,7 @@
     <w:p>
       <w:r>
         <w:pict w14:anchorId="3037A336">
-          <v:rect id="_x0000_i1086" style="width:0;height:1.5pt" o:hralign="center" o:hrstd="t" o:hr="t" fillcolor="#a0a0a0" stroked="f"/>
+          <v:rect id="_x0000_i1026" style="width:0;height:1.5pt" o:hralign="center" o:hrstd="t" o:hr="t" fillcolor="#a0a0a0" stroked="f"/>
         </w:pict>
       </w:r>
     </w:p>
@@ -1361,7 +1382,7 @@
     <w:p>
       <w:r>
         <w:pict w14:anchorId="617D1353">
-          <v:rect id="_x0000_i1087" style="width:0;height:1.5pt" o:hralign="center" o:hrstd="t" o:hr="t" fillcolor="#a0a0a0" stroked="f"/>
+          <v:rect id="_x0000_i1027" style="width:0;height:1.5pt" o:hralign="center" o:hrstd="t" o:hr="t" fillcolor="#a0a0a0" stroked="f"/>
         </w:pict>
       </w:r>
     </w:p>
@@ -1555,7 +1576,7 @@
     <w:p>
       <w:r>
         <w:pict w14:anchorId="165B46A6">
-          <v:rect id="_x0000_i1088" style="width:0;height:1.5pt" o:hralign="center" o:hrstd="t" o:hr="t" fillcolor="#a0a0a0" stroked="f"/>
+          <v:rect id="_x0000_i1028" style="width:0;height:1.5pt" o:hralign="center" o:hrstd="t" o:hr="t" fillcolor="#a0a0a0" stroked="f"/>
         </w:pict>
       </w:r>
     </w:p>
@@ -2007,7 +2028,7 @@
     <w:p>
       <w:r>
         <w:pict w14:anchorId="46B20C92">
-          <v:rect id="_x0000_i1089" style="width:0;height:1.5pt" o:hralign="center" o:hrstd="t" o:hr="t" fillcolor="#a0a0a0" stroked="f"/>
+          <v:rect id="_x0000_i1029" style="width:0;height:1.5pt" o:hralign="center" o:hrstd="t" o:hr="t" fillcolor="#a0a0a0" stroked="f"/>
         </w:pict>
       </w:r>
     </w:p>
@@ -2212,7 +2233,7 @@
     <w:p>
       <w:r>
         <w:pict w14:anchorId="379914B5">
-          <v:rect id="_x0000_i1090" style="width:0;height:1.5pt" o:hralign="center" o:hrstd="t" o:hr="t" fillcolor="#a0a0a0" stroked="f"/>
+          <v:rect id="_x0000_i1030" style="width:0;height:1.5pt" o:hralign="center" o:hrstd="t" o:hr="t" fillcolor="#a0a0a0" stroked="f"/>
         </w:pict>
       </w:r>
     </w:p>
@@ -2279,7 +2300,7 @@
     <w:p>
       <w:r>
         <w:pict w14:anchorId="06BC2B2A">
-          <v:rect id="_x0000_i1091" style="width:0;height:1.5pt" o:hralign="center" o:hrstd="t" o:hr="t" fillcolor="#a0a0a0" stroked="f"/>
+          <v:rect id="_x0000_i1031" style="width:0;height:1.5pt" o:hralign="center" o:hrstd="t" o:hr="t" fillcolor="#a0a0a0" stroked="f"/>
         </w:pict>
       </w:r>
     </w:p>
@@ -2332,7 +2353,7 @@
     <w:p>
       <w:r>
         <w:pict w14:anchorId="7BD0A1B4">
-          <v:rect id="_x0000_i1092" style="width:0;height:1.5pt" o:hralign="center" o:hrstd="t" o:hr="t" fillcolor="#a0a0a0" stroked="f"/>
+          <v:rect id="_x0000_i1032" style="width:0;height:1.5pt" o:hralign="center" o:hrstd="t" o:hr="t" fillcolor="#a0a0a0" stroked="f"/>
         </w:pict>
       </w:r>
     </w:p>
@@ -2633,7 +2654,7 @@
     <w:p>
       <w:r>
         <w:pict w14:anchorId="0DD8601E">
-          <v:rect id="_x0000_i1093" style="width:0;height:1.5pt" o:hralign="center" o:hrstd="t" o:hr="t" fillcolor="#a0a0a0" stroked="f"/>
+          <v:rect id="_x0000_i1033" style="width:0;height:1.5pt" o:hralign="center" o:hrstd="t" o:hr="t" fillcolor="#a0a0a0" stroked="f"/>
         </w:pict>
       </w:r>
     </w:p>
@@ -2809,7 +2830,7 @@
     <w:p>
       <w:r>
         <w:pict w14:anchorId="40EC1DC3">
-          <v:rect id="_x0000_i1094" style="width:0;height:1.5pt" o:hralign="center" o:hrstd="t" o:hr="t" fillcolor="#a0a0a0" stroked="f"/>
+          <v:rect id="_x0000_i1034" style="width:0;height:1.5pt" o:hralign="center" o:hrstd="t" o:hr="t" fillcolor="#a0a0a0" stroked="f"/>
         </w:pict>
       </w:r>
     </w:p>
@@ -3352,6 +3373,1532 @@
         <w:t>Đây là quy trình cốt lõi của ASP.NET Core MVC.</w:t>
       </w:r>
     </w:p>
+    <w:p>
+      <w:pPr>
+        <w:jc w:val="center"/>
+        <w:rPr>
+          <w:b/>
+          <w:bCs/>
+          <w:sz w:val="32"/>
+          <w:szCs w:val="32"/>
+        </w:rPr>
+      </w:pPr>
+      <w:r>
+        <w:rPr>
+          <w:b/>
+          <w:bCs/>
+          <w:sz w:val="32"/>
+          <w:szCs w:val="32"/>
+        </w:rPr>
+        <w:lastRenderedPageBreak/>
+        <w:t>Đăng ký dịch vụ để kết nối với SQL trong program.cs</w:t>
+      </w:r>
+    </w:p>
+    <w:p>
+      <w:pPr>
+        <w:rPr>
+          <w:b/>
+          <w:bCs/>
+        </w:rPr>
+      </w:pPr>
+      <w:r>
+        <w:rPr>
+          <w:b/>
+          <w:bCs/>
+        </w:rPr>
+        <w:t>AddDbContext là gì?</w:t>
+      </w:r>
+    </w:p>
+    <w:p>
+      <w:r>
+        <w:t>builder.Services.AddDbContext&lt;MyAppContext&gt;(options =&gt;</w:t>
+      </w:r>
+      <w:r>
+        <w:br/>
+        <w:t>{</w:t>
+      </w:r>
+      <w:r>
+        <w:br/>
+        <w:t xml:space="preserve">    options.UseSqlServer(</w:t>
+      </w:r>
+      <w:r>
+        <w:br/>
+        <w:t xml:space="preserve">        builder.Configuration.GetConnectionString("DefaultConnection"));</w:t>
+      </w:r>
+      <w:r>
+        <w:br/>
+        <w:t>});</w:t>
+      </w:r>
+    </w:p>
+    <w:p>
+      <w:r>
+        <w:rPr>
+          <w:b/>
+          <w:bCs/>
+        </w:rPr>
+        <w:t>Ý nghĩa:</w:t>
+      </w:r>
+      <w:r>
+        <w:t xml:space="preserve"> Đăng ký MyAppContext vào hệ thống Dependency Injection và cấu hình EF Core sử dụng SQL Server.</w:t>
+      </w:r>
+    </w:p>
+    <w:tbl>
+      <w:tblPr>
+        <w:tblW w:w="0" w:type="auto"/>
+        <w:tblCellSpacing w:w="15" w:type="dxa"/>
+        <w:tblCellMar>
+          <w:top w:w="15" w:type="dxa"/>
+          <w:left w:w="15" w:type="dxa"/>
+          <w:bottom w:w="15" w:type="dxa"/>
+          <w:right w:w="15" w:type="dxa"/>
+        </w:tblCellMar>
+        <w:tblLook w:val="04A0" w:firstRow="1" w:lastRow="0" w:firstColumn="1" w:lastColumn="0" w:noHBand="0" w:noVBand="1"/>
+      </w:tblPr>
+      <w:tblGrid>
+        <w:gridCol w:w="3344"/>
+        <w:gridCol w:w="3674"/>
+      </w:tblGrid>
+      <w:tr>
+        <w:trPr>
+          <w:tblHeader/>
+          <w:tblCellSpacing w:w="15" w:type="dxa"/>
+        </w:trPr>
+        <w:tc>
+          <w:tcPr>
+            <w:tcW w:w="0" w:type="auto"/>
+            <w:vAlign w:val="center"/>
+            <w:hideMark/>
+          </w:tcPr>
+          <w:p>
+            <w:pPr>
+              <w:rPr>
+                <w:b/>
+                <w:bCs/>
+              </w:rPr>
+            </w:pPr>
+            <w:r>
+              <w:rPr>
+                <w:b/>
+                <w:bCs/>
+              </w:rPr>
+              <w:t>Thành phần</w:t>
+            </w:r>
+          </w:p>
+        </w:tc>
+        <w:tc>
+          <w:tcPr>
+            <w:tcW w:w="0" w:type="auto"/>
+            <w:vAlign w:val="center"/>
+            <w:hideMark/>
+          </w:tcPr>
+          <w:p>
+            <w:pPr>
+              <w:rPr>
+                <w:b/>
+                <w:bCs/>
+              </w:rPr>
+            </w:pPr>
+            <w:r>
+              <w:rPr>
+                <w:b/>
+                <w:bCs/>
+              </w:rPr>
+              <w:t>Chức năng</w:t>
+            </w:r>
+          </w:p>
+        </w:tc>
+      </w:tr>
+      <w:tr>
+        <w:trPr>
+          <w:tblCellSpacing w:w="15" w:type="dxa"/>
+        </w:trPr>
+        <w:tc>
+          <w:tcPr>
+            <w:tcW w:w="0" w:type="auto"/>
+            <w:vAlign w:val="center"/>
+            <w:hideMark/>
+          </w:tcPr>
+          <w:p>
+            <w:r>
+              <w:t>builder.Services</w:t>
+            </w:r>
+          </w:p>
+        </w:tc>
+        <w:tc>
+          <w:tcPr>
+            <w:tcW w:w="0" w:type="auto"/>
+            <w:vAlign w:val="center"/>
+            <w:hideMark/>
+          </w:tcPr>
+          <w:p>
+            <w:r>
+              <w:t>Nơi đăng ký các service</w:t>
+            </w:r>
+          </w:p>
+        </w:tc>
+      </w:tr>
+      <w:tr>
+        <w:trPr>
+          <w:tblCellSpacing w:w="15" w:type="dxa"/>
+        </w:trPr>
+        <w:tc>
+          <w:tcPr>
+            <w:tcW w:w="0" w:type="auto"/>
+            <w:vAlign w:val="center"/>
+            <w:hideMark/>
+          </w:tcPr>
+          <w:p>
+            <w:r>
+              <w:t>AddDbContext&lt;MyAppContext&gt;()</w:t>
+            </w:r>
+          </w:p>
+        </w:tc>
+        <w:tc>
+          <w:tcPr>
+            <w:tcW w:w="0" w:type="auto"/>
+            <w:vAlign w:val="center"/>
+            <w:hideMark/>
+          </w:tcPr>
+          <w:p>
+            <w:r>
+              <w:t>Đăng ký MyAppContext</w:t>
+            </w:r>
+          </w:p>
+        </w:tc>
+      </w:tr>
+      <w:tr>
+        <w:trPr>
+          <w:tblCellSpacing w:w="15" w:type="dxa"/>
+        </w:trPr>
+        <w:tc>
+          <w:tcPr>
+            <w:tcW w:w="0" w:type="auto"/>
+            <w:vAlign w:val="center"/>
+            <w:hideMark/>
+          </w:tcPr>
+          <w:p>
+            <w:r>
+              <w:t>options</w:t>
+            </w:r>
+          </w:p>
+        </w:tc>
+        <w:tc>
+          <w:tcPr>
+            <w:tcW w:w="0" w:type="auto"/>
+            <w:vAlign w:val="center"/>
+            <w:hideMark/>
+          </w:tcPr>
+          <w:p>
+            <w:r>
+              <w:t>Đối tượng cấu hình EF Core</w:t>
+            </w:r>
+          </w:p>
+        </w:tc>
+      </w:tr>
+      <w:tr>
+        <w:trPr>
+          <w:tblCellSpacing w:w="15" w:type="dxa"/>
+        </w:trPr>
+        <w:tc>
+          <w:tcPr>
+            <w:tcW w:w="0" w:type="auto"/>
+            <w:vAlign w:val="center"/>
+            <w:hideMark/>
+          </w:tcPr>
+          <w:p>
+            <w:r>
+              <w:t>UseSqlServer()</w:t>
+            </w:r>
+          </w:p>
+        </w:tc>
+        <w:tc>
+          <w:tcPr>
+            <w:tcW w:w="0" w:type="auto"/>
+            <w:vAlign w:val="center"/>
+            <w:hideMark/>
+          </w:tcPr>
+          <w:p>
+            <w:r>
+              <w:t>Chỉ định dùng SQL Server</w:t>
+            </w:r>
+          </w:p>
+        </w:tc>
+      </w:tr>
+      <w:tr>
+        <w:trPr>
+          <w:tblCellSpacing w:w="15" w:type="dxa"/>
+        </w:trPr>
+        <w:tc>
+          <w:tcPr>
+            <w:tcW w:w="0" w:type="auto"/>
+            <w:vAlign w:val="center"/>
+            <w:hideMark/>
+          </w:tcPr>
+          <w:p>
+            <w:r>
+              <w:t>GetConnectionString()</w:t>
+            </w:r>
+          </w:p>
+        </w:tc>
+        <w:tc>
+          <w:tcPr>
+            <w:tcW w:w="0" w:type="auto"/>
+            <w:vAlign w:val="center"/>
+            <w:hideMark/>
+          </w:tcPr>
+          <w:p>
+            <w:r>
+              <w:t>Đọc chuỗi kết nối từ appsettings.json</w:t>
+            </w:r>
+          </w:p>
+        </w:tc>
+      </w:tr>
+    </w:tbl>
+    <w:p>
+      <w:pPr>
+        <w:rPr>
+          <w:b/>
+          <w:bCs/>
+        </w:rPr>
+      </w:pPr>
+      <w:r>
+        <w:rPr>
+          <w:b/>
+          <w:bCs/>
+        </w:rPr>
+        <w:t>Luồng hoạt động</w:t>
+      </w:r>
+    </w:p>
+    <w:p>
+      <w:r>
+        <w:t>appsettings.json</w:t>
+      </w:r>
+      <w:r>
+        <w:br/>
+        <w:t xml:space="preserve">      ↓</w:t>
+      </w:r>
+      <w:r>
+        <w:br/>
+        <w:t>Connection String</w:t>
+      </w:r>
+      <w:r>
+        <w:br/>
+        <w:t xml:space="preserve">      ↓</w:t>
+      </w:r>
+      <w:r>
+        <w:br/>
+        <w:t>UseSqlServer()</w:t>
+      </w:r>
+      <w:r>
+        <w:br/>
+        <w:t xml:space="preserve">      ↓</w:t>
+      </w:r>
+      <w:r>
+        <w:br/>
+        <w:t>MyAppContext</w:t>
+      </w:r>
+      <w:r>
+        <w:br/>
+        <w:t xml:space="preserve">      ↓</w:t>
+      </w:r>
+      <w:r>
+        <w:br/>
+        <w:t>SQL Server Database</w:t>
+      </w:r>
+    </w:p>
+    <w:p>
+      <w:pPr>
+        <w:rPr>
+          <w:b/>
+          <w:bCs/>
+        </w:rPr>
+      </w:pPr>
+      <w:r>
+        <w:rPr>
+          <w:b/>
+          <w:bCs/>
+        </w:rPr>
+        <w:t>Kết quả</w:t>
+      </w:r>
+    </w:p>
+    <w:p>
+      <w:r>
+        <w:t>Có thể inject MyAppContext vào Controller:</w:t>
+      </w:r>
+    </w:p>
+    <w:p>
+      <w:r>
+        <w:t>public class ItemsController : Controller</w:t>
+      </w:r>
+      <w:r>
+        <w:br/>
+        <w:t>{</w:t>
+      </w:r>
+      <w:r>
+        <w:br/>
+        <w:t xml:space="preserve">    private readonly MyAppContext _context;</w:t>
+      </w:r>
+      <w:r>
+        <w:br/>
+      </w:r>
+      <w:r>
+        <w:lastRenderedPageBreak/>
+        <w:br/>
+        <w:t xml:space="preserve">    public ItemsController(MyAppContext context)</w:t>
+      </w:r>
+      <w:r>
+        <w:br/>
+        <w:t xml:space="preserve">    {</w:t>
+      </w:r>
+      <w:r>
+        <w:br/>
+        <w:t xml:space="preserve">        _context = context;</w:t>
+      </w:r>
+      <w:r>
+        <w:br/>
+        <w:t xml:space="preserve">    }</w:t>
+      </w:r>
+      <w:r>
+        <w:br/>
+        <w:t>}</w:t>
+      </w:r>
+    </w:p>
+    <w:p>
+      <w:r>
+        <w:rPr>
+          <w:rFonts w:ascii="Segoe UI Emoji" w:hAnsi="Segoe UI Emoji" w:cs="Segoe UI Emoji"/>
+        </w:rPr>
+        <w:t>➡️</w:t>
+      </w:r>
+      <w:r>
+        <w:t xml:space="preserve"> ASP.NET Core tự tạo và cung cấp MyAppContext khi cần.</w:t>
+      </w:r>
+    </w:p>
+    <w:p>
+      <w:r>
+        <w:br w:type="page"/>
+      </w:r>
+    </w:p>
+    <w:p>
+      <w:pPr>
+        <w:jc w:val="center"/>
+        <w:rPr>
+          <w:b/>
+          <w:bCs/>
+          <w:sz w:val="32"/>
+          <w:szCs w:val="32"/>
+        </w:rPr>
+      </w:pPr>
+      <w:r>
+        <w:rPr>
+          <w:b/>
+          <w:bCs/>
+          <w:sz w:val="32"/>
+          <w:szCs w:val="32"/>
+        </w:rPr>
+        <w:lastRenderedPageBreak/>
+        <w:t>Code First</w:t>
+      </w:r>
+    </w:p>
+    <w:p>
+      <w:r>
+        <w:rPr>
+          <w:noProof/>
+        </w:rPr>
+        <w:drawing>
+          <wp:inline distT="0" distB="0" distL="0" distR="0" wp14:anchorId="474016E7" wp14:editId="44004C68">
+            <wp:extent cx="4632489" cy="3455560"/>
+            <wp:effectExtent l="0" t="0" r="0" b="0"/>
+            <wp:docPr id="50760465" name="Picture 1"/>
+            <wp:cNvGraphicFramePr>
+              <a:graphicFrameLocks xmlns:a="http://schemas.openxmlformats.org/drawingml/2006/main" noChangeAspect="1"/>
+            </wp:cNvGraphicFramePr>
+            <a:graphic xmlns:a="http://schemas.openxmlformats.org/drawingml/2006/main">
+              <a:graphicData uri="http://schemas.openxmlformats.org/drawingml/2006/picture">
+                <pic:pic xmlns:pic="http://schemas.openxmlformats.org/drawingml/2006/picture">
+                  <pic:nvPicPr>
+                    <pic:cNvPr id="50760465" name=""/>
+                    <pic:cNvPicPr/>
+                  </pic:nvPicPr>
+                  <pic:blipFill>
+                    <a:blip r:embed="rId15"/>
+                    <a:stretch>
+                      <a:fillRect/>
+                    </a:stretch>
+                  </pic:blipFill>
+                  <pic:spPr>
+                    <a:xfrm>
+                      <a:off x="0" y="0"/>
+                      <a:ext cx="4636227" cy="3458348"/>
+                    </a:xfrm>
+                    <a:prstGeom prst="rect">
+                      <a:avLst/>
+                    </a:prstGeom>
+                  </pic:spPr>
+                </pic:pic>
+              </a:graphicData>
+            </a:graphic>
+          </wp:inline>
+        </w:drawing>
+      </w:r>
+    </w:p>
+    <w:p>
+      <w:r>
+        <w:rPr>
+          <w:noProof/>
+        </w:rPr>
+        <w:drawing>
+          <wp:inline distT="0" distB="0" distL="0" distR="0" wp14:anchorId="0190D59C" wp14:editId="4DD77B4F">
+            <wp:extent cx="4794637" cy="3368539"/>
+            <wp:effectExtent l="0" t="0" r="6350" b="3810"/>
+            <wp:docPr id="46675886" name="Picture 1"/>
+            <wp:cNvGraphicFramePr>
+              <a:graphicFrameLocks xmlns:a="http://schemas.openxmlformats.org/drawingml/2006/main" noChangeAspect="1"/>
+            </wp:cNvGraphicFramePr>
+            <a:graphic xmlns:a="http://schemas.openxmlformats.org/drawingml/2006/main">
+              <a:graphicData uri="http://schemas.openxmlformats.org/drawingml/2006/picture">
+                <pic:pic xmlns:pic="http://schemas.openxmlformats.org/drawingml/2006/picture">
+                  <pic:nvPicPr>
+                    <pic:cNvPr id="46675886" name=""/>
+                    <pic:cNvPicPr/>
+                  </pic:nvPicPr>
+                  <pic:blipFill>
+                    <a:blip r:embed="rId16"/>
+                    <a:stretch>
+                      <a:fillRect/>
+                    </a:stretch>
+                  </pic:blipFill>
+                  <pic:spPr>
+                    <a:xfrm>
+                      <a:off x="0" y="0"/>
+                      <a:ext cx="4802963" cy="3374389"/>
+                    </a:xfrm>
+                    <a:prstGeom prst="rect">
+                      <a:avLst/>
+                    </a:prstGeom>
+                  </pic:spPr>
+                </pic:pic>
+              </a:graphicData>
+            </a:graphic>
+          </wp:inline>
+        </w:drawing>
+      </w:r>
+    </w:p>
+    <w:p>
+      <w:r>
+        <w:br w:type="page"/>
+      </w:r>
+    </w:p>
+    <w:p>
+      <w:pPr>
+        <w:jc w:val="center"/>
+        <w:rPr>
+          <w:b/>
+          <w:bCs/>
+          <w:sz w:val="32"/>
+          <w:szCs w:val="32"/>
+        </w:rPr>
+      </w:pPr>
+      <w:r>
+        <w:rPr>
+          <w:b/>
+          <w:bCs/>
+          <w:sz w:val="32"/>
+          <w:szCs w:val="32"/>
+        </w:rPr>
+        <w:lastRenderedPageBreak/>
+        <w:t>DATABASE FIRST</w:t>
+      </w:r>
+    </w:p>
+    <w:p/>
+    <w:p>
+      <w:r>
+        <w:t>Scaffold-DbContext "Data Source=LAPTOP-NBKHUSGP;Initial Catalog=MenuBlazor_Data;Integrated Security=True;Pooling=False;Encrypt=False;Trust Server Certificate=True" Microsoft.EntityFrameworkCore.SqlServer -ContextDir Data -OutputDir Models -DataAnnotations</w:t>
+      </w:r>
+    </w:p>
+    <w:p/>
+    <w:p>
+      <w:r>
+        <w:rPr>
+          <w:noProof/>
+        </w:rPr>
+        <w:drawing>
+          <wp:inline distT="0" distB="0" distL="0" distR="0" wp14:anchorId="0B040522" wp14:editId="2890F907">
+            <wp:extent cx="5943600" cy="4267200"/>
+            <wp:effectExtent l="0" t="0" r="0" b="0"/>
+            <wp:docPr id="1739793163" name="Picture 1"/>
+            <wp:cNvGraphicFramePr>
+              <a:graphicFrameLocks xmlns:a="http://schemas.openxmlformats.org/drawingml/2006/main" noChangeAspect="1"/>
+            </wp:cNvGraphicFramePr>
+            <a:graphic xmlns:a="http://schemas.openxmlformats.org/drawingml/2006/main">
+              <a:graphicData uri="http://schemas.openxmlformats.org/drawingml/2006/picture">
+                <pic:pic xmlns:pic="http://schemas.openxmlformats.org/drawingml/2006/picture">
+                  <pic:nvPicPr>
+                    <pic:cNvPr id="1739793163" name=""/>
+                    <pic:cNvPicPr/>
+                  </pic:nvPicPr>
+                  <pic:blipFill>
+                    <a:blip r:embed="rId17"/>
+                    <a:stretch>
+                      <a:fillRect/>
+                    </a:stretch>
+                  </pic:blipFill>
+                  <pic:spPr>
+                    <a:xfrm>
+                      <a:off x="0" y="0"/>
+                      <a:ext cx="5943600" cy="4267200"/>
+                    </a:xfrm>
+                    <a:prstGeom prst="rect">
+                      <a:avLst/>
+                    </a:prstGeom>
+                  </pic:spPr>
+                </pic:pic>
+              </a:graphicData>
+            </a:graphic>
+          </wp:inline>
+        </w:drawing>
+      </w:r>
+    </w:p>
+    <w:p>
+      <w:r>
+        <w:t xml:space="preserve">Đây là lệnh </w:t>
+      </w:r>
+      <w:r>
+        <w:rPr>
+          <w:b/>
+          <w:bCs/>
+        </w:rPr>
+        <w:t>Database First</w:t>
+      </w:r>
+      <w:r>
+        <w:t xml:space="preserve"> của Entity Framework Core.</w:t>
+      </w:r>
+    </w:p>
+    <w:p>
+      <w:r>
+        <w:rPr>
+          <w:rFonts w:ascii="Segoe UI Emoji" w:hAnsi="Segoe UI Emoji" w:cs="Segoe UI Emoji"/>
+        </w:rPr>
+        <w:t>👉</w:t>
+      </w:r>
+      <w:r>
+        <w:t xml:space="preserve"> Chức năng: </w:t>
+      </w:r>
+      <w:r>
+        <w:rPr>
+          <w:b/>
+          <w:bCs/>
+        </w:rPr>
+        <w:t>Đọc Database có sẵn và tự động sinh ra Model + DbContext</w:t>
+      </w:r>
+      <w:r>
+        <w:t>.</w:t>
+      </w:r>
+    </w:p>
+    <w:p>
+      <w:r>
+        <w:rPr>
+          <w:rFonts w:ascii="Segoe UI Emoji" w:hAnsi="Segoe UI Emoji" w:cs="Segoe UI Emoji"/>
+        </w:rPr>
+        <w:t>📌</w:t>
+      </w:r>
+      <w:r>
+        <w:t xml:space="preserve"> Nếu mục tiêu của bạn là học ASP.NET Core để làm web thực tế và đi xin việc Fullstack, hãy tập trung </w:t>
+      </w:r>
+      <w:r>
+        <w:rPr>
+          <w:b/>
+          <w:bCs/>
+        </w:rPr>
+        <w:t>Code First + Migration</w:t>
+      </w:r>
+      <w:r>
+        <w:t xml:space="preserve"> trước. Đây là hướng mà đa số khóa học ASP.NET Core hiện nay sử dụng.</w:t>
+      </w:r>
+    </w:p>
+    <w:p>
+      <w:r>
+        <w:br w:type="page"/>
+      </w:r>
+    </w:p>
+    <w:p>
+      <w:pPr>
+        <w:jc w:val="center"/>
+        <w:rPr>
+          <w:b/>
+          <w:bCs/>
+          <w:sz w:val="32"/>
+          <w:szCs w:val="32"/>
+        </w:rPr>
+      </w:pPr>
+      <w:r>
+        <w:rPr>
+          <w:b/>
+          <w:bCs/>
+          <w:sz w:val="32"/>
+          <w:szCs w:val="32"/>
+        </w:rPr>
+        <w:lastRenderedPageBreak/>
+        <w:t>ĐỒNG BỘ VÀ BẤT ĐỒNG BỘ</w:t>
+      </w:r>
+    </w:p>
+    <w:p>
+      <w:r>
+        <w:rPr>
+          <w:noProof/>
+        </w:rPr>
+        <w:drawing>
+          <wp:inline distT="0" distB="0" distL="0" distR="0" wp14:anchorId="67DEBCF4" wp14:editId="1A66AEB2">
+            <wp:extent cx="5550010" cy="5013983"/>
+            <wp:effectExtent l="0" t="0" r="0" b="0"/>
+            <wp:docPr id="553235099" name="Picture 1"/>
+            <wp:cNvGraphicFramePr>
+              <a:graphicFrameLocks xmlns:a="http://schemas.openxmlformats.org/drawingml/2006/main" noChangeAspect="1"/>
+            </wp:cNvGraphicFramePr>
+            <a:graphic xmlns:a="http://schemas.openxmlformats.org/drawingml/2006/main">
+              <a:graphicData uri="http://schemas.openxmlformats.org/drawingml/2006/picture">
+                <pic:pic xmlns:pic="http://schemas.openxmlformats.org/drawingml/2006/picture">
+                  <pic:nvPicPr>
+                    <pic:cNvPr id="553235099" name=""/>
+                    <pic:cNvPicPr/>
+                  </pic:nvPicPr>
+                  <pic:blipFill>
+                    <a:blip r:embed="rId18"/>
+                    <a:stretch>
+                      <a:fillRect/>
+                    </a:stretch>
+                  </pic:blipFill>
+                  <pic:spPr>
+                    <a:xfrm>
+                      <a:off x="0" y="0"/>
+                      <a:ext cx="5558544" cy="5021693"/>
+                    </a:xfrm>
+                    <a:prstGeom prst="rect">
+                      <a:avLst/>
+                    </a:prstGeom>
+                  </pic:spPr>
+                </pic:pic>
+              </a:graphicData>
+            </a:graphic>
+          </wp:inline>
+        </w:drawing>
+      </w:r>
+    </w:p>
+    <w:p>
+      <w:r>
+        <w:rPr>
+          <w:noProof/>
+        </w:rPr>
+        <w:drawing>
+          <wp:inline distT="0" distB="0" distL="0" distR="0" wp14:anchorId="12FB5C0A" wp14:editId="0E577E83">
+            <wp:extent cx="4993419" cy="2321726"/>
+            <wp:effectExtent l="0" t="0" r="0" b="2540"/>
+            <wp:docPr id="258238775" name="Picture 1"/>
+            <wp:cNvGraphicFramePr>
+              <a:graphicFrameLocks xmlns:a="http://schemas.openxmlformats.org/drawingml/2006/main" noChangeAspect="1"/>
+            </wp:cNvGraphicFramePr>
+            <a:graphic xmlns:a="http://schemas.openxmlformats.org/drawingml/2006/main">
+              <a:graphicData uri="http://schemas.openxmlformats.org/drawingml/2006/picture">
+                <pic:pic xmlns:pic="http://schemas.openxmlformats.org/drawingml/2006/picture">
+                  <pic:nvPicPr>
+                    <pic:cNvPr id="258238775" name=""/>
+                    <pic:cNvPicPr/>
+                  </pic:nvPicPr>
+                  <pic:blipFill>
+                    <a:blip r:embed="rId19"/>
+                    <a:stretch>
+                      <a:fillRect/>
+                    </a:stretch>
+                  </pic:blipFill>
+                  <pic:spPr>
+                    <a:xfrm>
+                      <a:off x="0" y="0"/>
+                      <a:ext cx="4996685" cy="2323245"/>
+                    </a:xfrm>
+                    <a:prstGeom prst="rect">
+                      <a:avLst/>
+                    </a:prstGeom>
+                  </pic:spPr>
+                </pic:pic>
+              </a:graphicData>
+            </a:graphic>
+          </wp:inline>
+        </w:drawing>
+      </w:r>
+    </w:p>
+    <w:p>
+      <w:r>
+        <w:br w:type="page"/>
+      </w:r>
+    </w:p>
+    <w:p>
+      <w:pPr>
+        <w:rPr>
+          <w:b/>
+          <w:bCs/>
+        </w:rPr>
+      </w:pPr>
+      <w:r>
+        <w:rPr>
+          <w:b/>
+          <w:bCs/>
+        </w:rPr>
+        <w:lastRenderedPageBreak/>
+        <w:t>Giải thích:</w:t>
+      </w:r>
+    </w:p>
+    <w:p>
+      <w:pPr>
+        <w:rPr>
+          <w:b/>
+          <w:bCs/>
+        </w:rPr>
+      </w:pPr>
+      <w:r>
+        <w:rPr>
+          <w:b/>
+          <w:bCs/>
+        </w:rPr>
+        <w:t>1. Đồng bộ (Synchronous)</w:t>
+      </w:r>
+    </w:p>
+    <w:p>
+      <w:pPr>
+        <w:rPr>
+          <w:color w:val="EE0000"/>
+        </w:rPr>
+      </w:pPr>
+      <w:r>
+        <w:rPr>
+          <w:color w:val="EE0000"/>
+        </w:rPr>
+        <w:t>Bạn gọi trà sữa</w:t>
+      </w:r>
+      <w:r>
+        <w:rPr>
+          <w:color w:val="EE0000"/>
+        </w:rPr>
+        <w:br/>
+        <w:t xml:space="preserve">      ↓</w:t>
+      </w:r>
+      <w:r>
+        <w:rPr>
+          <w:color w:val="EE0000"/>
+        </w:rPr>
+        <w:br/>
+        <w:t>Đứng đợi tại quầy</w:t>
+      </w:r>
+      <w:r>
+        <w:rPr>
+          <w:color w:val="EE0000"/>
+        </w:rPr>
+        <w:br/>
+        <w:t xml:space="preserve">      ↓</w:t>
+      </w:r>
+      <w:r>
+        <w:rPr>
+          <w:color w:val="EE0000"/>
+        </w:rPr>
+        <w:br/>
+        <w:t>Nhận trà sữa</w:t>
+      </w:r>
+      <w:r>
+        <w:rPr>
+          <w:color w:val="EE0000"/>
+        </w:rPr>
+        <w:br/>
+        <w:t xml:space="preserve">      ↓</w:t>
+      </w:r>
+      <w:r>
+        <w:rPr>
+          <w:color w:val="EE0000"/>
+        </w:rPr>
+        <w:br/>
+        <w:t>Mới làm việc khác</w:t>
+      </w:r>
+    </w:p>
+    <w:p>
+      <w:r>
+        <w:t>Ví dụ:</w:t>
+      </w:r>
+    </w:p>
+    <w:p>
+      <w:r>
+        <w:t>var items = _context.Items.ToList();</w:t>
+      </w:r>
+    </w:p>
+    <w:p>
+      <w:r>
+        <w:t>Khi truy vấn Database:</w:t>
+      </w:r>
+    </w:p>
+    <w:p>
+      <w:pPr>
+        <w:rPr>
+          <w:color w:val="EE0000"/>
+        </w:rPr>
+      </w:pPr>
+      <w:r>
+        <w:rPr>
+          <w:color w:val="EE0000"/>
+        </w:rPr>
+        <w:t>Controller</w:t>
+      </w:r>
+      <w:r>
+        <w:rPr>
+          <w:color w:val="EE0000"/>
+        </w:rPr>
+        <w:br/>
+        <w:t xml:space="preserve">    ↓</w:t>
+      </w:r>
+      <w:r>
+        <w:rPr>
+          <w:color w:val="EE0000"/>
+        </w:rPr>
+        <w:br/>
+        <w:t>Database</w:t>
+      </w:r>
+      <w:r>
+        <w:rPr>
+          <w:color w:val="EE0000"/>
+        </w:rPr>
+        <w:br/>
+        <w:t xml:space="preserve">    ↓</w:t>
+      </w:r>
+      <w:r>
+        <w:rPr>
+          <w:color w:val="EE0000"/>
+        </w:rPr>
+        <w:br/>
+        <w:t>Chờ...</w:t>
+      </w:r>
+      <w:r>
+        <w:rPr>
+          <w:color w:val="EE0000"/>
+        </w:rPr>
+        <w:br/>
+        <w:t xml:space="preserve">    ↓</w:t>
+      </w:r>
+      <w:r>
+        <w:rPr>
+          <w:color w:val="EE0000"/>
+        </w:rPr>
+        <w:br/>
+        <w:t>Có dữ liệu</w:t>
+      </w:r>
+      <w:r>
+        <w:rPr>
+          <w:color w:val="EE0000"/>
+        </w:rPr>
+        <w:br/>
+        <w:t xml:space="preserve">    ↓</w:t>
+      </w:r>
+      <w:r>
+        <w:rPr>
+          <w:color w:val="EE0000"/>
+        </w:rPr>
+        <w:br/>
+        <w:t>Chạy tiếp</w:t>
+      </w:r>
+    </w:p>
+    <w:p>
+      <w:r>
+        <w:t>Trong lúc chờ Database trả dữ liệu, luồng bị "đứng yên".</w:t>
+      </w:r>
+    </w:p>
+    <w:p>
+      <w:r>
+        <w:pict w14:anchorId="2F5C412A">
+          <v:rect id="_x0000_i1035" style="width:0;height:1.5pt" o:hralign="center" o:hrstd="t" o:hr="t" fillcolor="#a0a0a0" stroked="f"/>
+        </w:pict>
+      </w:r>
+    </w:p>
+    <w:p>
+      <w:pPr>
+        <w:rPr>
+          <w:b/>
+          <w:bCs/>
+        </w:rPr>
+      </w:pPr>
+      <w:r>
+        <w:rPr>
+          <w:b/>
+          <w:bCs/>
+        </w:rPr>
+        <w:t>2. Bất đồng bộ (Asynchronous)</w:t>
+      </w:r>
+    </w:p>
+    <w:p>
+      <w:pPr>
+        <w:rPr>
+          <w:color w:val="EE0000"/>
+        </w:rPr>
+      </w:pPr>
+      <w:r>
+        <w:rPr>
+          <w:color w:val="EE0000"/>
+        </w:rPr>
+        <w:t>Bạn gọi trà sữa</w:t>
+      </w:r>
+      <w:r>
+        <w:rPr>
+          <w:color w:val="EE0000"/>
+        </w:rPr>
+        <w:br/>
+        <w:t xml:space="preserve">      ↓</w:t>
+      </w:r>
+      <w:r>
+        <w:rPr>
+          <w:color w:val="EE0000"/>
+        </w:rPr>
+        <w:br/>
+        <w:t>Lấy số thứ tự</w:t>
+      </w:r>
+      <w:r>
+        <w:rPr>
+          <w:color w:val="EE0000"/>
+        </w:rPr>
+        <w:br/>
+        <w:t xml:space="preserve">      ↓</w:t>
+      </w:r>
+      <w:r>
+        <w:rPr>
+          <w:color w:val="EE0000"/>
+        </w:rPr>
+        <w:br/>
+        <w:t>Đi làm việc khác</w:t>
+      </w:r>
+      <w:r>
+        <w:rPr>
+          <w:color w:val="EE0000"/>
+        </w:rPr>
+        <w:br/>
+        <w:t xml:space="preserve">      ↓</w:t>
+      </w:r>
+      <w:r>
+        <w:rPr>
+          <w:color w:val="EE0000"/>
+        </w:rPr>
+        <w:br/>
+        <w:t>Có trà sữa thì quay lại lấy</w:t>
+      </w:r>
+    </w:p>
+    <w:p>
+      <w:r>
+        <w:t>Ví dụ:</w:t>
+      </w:r>
+    </w:p>
+    <w:p>
+      <w:r>
+        <w:lastRenderedPageBreak/>
+        <w:t>var items = await _context.Items.ToListAsync();</w:t>
+      </w:r>
+    </w:p>
+    <w:p>
+      <w:r>
+        <w:t>Khi truy vấn Database:</w:t>
+      </w:r>
+    </w:p>
+    <w:p>
+      <w:pPr>
+        <w:rPr>
+          <w:color w:val="EE0000"/>
+        </w:rPr>
+      </w:pPr>
+      <w:r>
+        <w:rPr>
+          <w:color w:val="EE0000"/>
+        </w:rPr>
+        <w:t>Controller</w:t>
+      </w:r>
+      <w:r>
+        <w:rPr>
+          <w:color w:val="EE0000"/>
+        </w:rPr>
+        <w:br/>
+        <w:t xml:space="preserve">    ↓</w:t>
+      </w:r>
+      <w:r>
+        <w:rPr>
+          <w:color w:val="EE0000"/>
+        </w:rPr>
+        <w:br/>
+        <w:t>Gửi yêu cầu Database</w:t>
+      </w:r>
+      <w:r>
+        <w:rPr>
+          <w:color w:val="EE0000"/>
+        </w:rPr>
+        <w:br/>
+        <w:t xml:space="preserve">    ↓</w:t>
+      </w:r>
+      <w:r>
+        <w:rPr>
+          <w:color w:val="EE0000"/>
+        </w:rPr>
+        <w:br/>
+        <w:t>Tạm nhường luồng</w:t>
+      </w:r>
+      <w:r>
+        <w:rPr>
+          <w:color w:val="EE0000"/>
+        </w:rPr>
+        <w:br/>
+        <w:t xml:space="preserve">    ↓</w:t>
+      </w:r>
+      <w:r>
+        <w:rPr>
+          <w:color w:val="EE0000"/>
+        </w:rPr>
+        <w:br/>
+        <w:t>Database xử lý</w:t>
+      </w:r>
+      <w:r>
+        <w:rPr>
+          <w:color w:val="EE0000"/>
+        </w:rPr>
+        <w:br/>
+        <w:t xml:space="preserve">    ↓</w:t>
+      </w:r>
+      <w:r>
+        <w:rPr>
+          <w:color w:val="EE0000"/>
+        </w:rPr>
+        <w:br/>
+        <w:t>Có kết quả</w:t>
+      </w:r>
+      <w:r>
+        <w:rPr>
+          <w:color w:val="EE0000"/>
+        </w:rPr>
+        <w:br/>
+        <w:t xml:space="preserve">    ↓</w:t>
+      </w:r>
+      <w:r>
+        <w:rPr>
+          <w:color w:val="EE0000"/>
+        </w:rPr>
+        <w:br/>
+        <w:t>Tiếp tục chạy</w:t>
+      </w:r>
+    </w:p>
+    <w:p>
+      <w:r>
+        <w:t>Luồng không bị giữ lại vô ích.</w:t>
+      </w:r>
+    </w:p>
+    <w:p>
+      <w:r>
+        <w:br w:type="page"/>
+      </w:r>
+    </w:p>
+    <w:p>
+      <w:r>
+        <w:rPr>
+          <w:b/>
+          <w:bCs/>
+        </w:rPr>
+        <w:lastRenderedPageBreak/>
+        <w:t>asp-for</w:t>
+      </w:r>
+      <w:r>
+        <w:t>="Name"</w:t>
+      </w:r>
+    </w:p>
+    <w:p>
+      <w:r>
+        <w:t>Input này đại diện cho thuộc tính Name của Model.</w:t>
+      </w:r>
+    </w:p>
+    <w:p>
+      <w:pPr>
+        <w:rPr>
+          <w:color w:val="EE0000"/>
+        </w:rPr>
+      </w:pPr>
+      <w:r>
+        <w:rPr>
+          <w:color w:val="EE0000"/>
+        </w:rPr>
+        <w:t>asp-for="TênThuộcTính"</w:t>
+      </w:r>
+    </w:p>
+    <w:p>
+      <w:pPr>
+        <w:rPr>
+          <w:color w:val="EE0000"/>
+        </w:rPr>
+      </w:pPr>
+      <w:r>
+        <w:rPr>
+          <w:color w:val="EE0000"/>
+        </w:rPr>
+        <w:t xml:space="preserve">thì hiểu ngay là nó đang </w:t>
+      </w:r>
+      <w:r>
+        <w:rPr>
+          <w:b/>
+          <w:bCs/>
+          <w:color w:val="EE0000"/>
+        </w:rPr>
+        <w:t>gắn thẻ HTML với một thuộc tính trong Model</w:t>
+      </w:r>
+      <w:r>
+        <w:rPr>
+          <w:color w:val="EE0000"/>
+        </w:rPr>
+        <w:t xml:space="preserve"> để ASP.NET tự động xử lý dữ liệu.</w:t>
+      </w:r>
+    </w:p>
+    <w:p>
+      <w:pPr>
+        <w:rPr>
+          <w:color w:val="EE0000"/>
+        </w:rPr>
+      </w:pPr>
+    </w:p>
+    <w:p>
+      <w:pPr>
+        <w:rPr>
+          <w:b/>
+          <w:bCs/>
+          <w:color w:val="EE0000"/>
+        </w:rPr>
+      </w:pPr>
+      <w:r>
+        <w:rPr>
+          <w:b/>
+          <w:bCs/>
+          <w:color w:val="EE0000"/>
+        </w:rPr>
+        <w:br w:type="page"/>
+      </w:r>
+    </w:p>
+    <w:p>
+      <w:pPr>
+        <w:jc w:val="center"/>
+        <w:rPr>
+          <w:b/>
+          <w:bCs/>
+          <w:sz w:val="32"/>
+          <w:szCs w:val="32"/>
+        </w:rPr>
+      </w:pPr>
+      <w:r>
+        <w:rPr>
+          <w:b/>
+          <w:bCs/>
+          <w:sz w:val="32"/>
+          <w:szCs w:val="32"/>
+        </w:rPr>
+        <w:lastRenderedPageBreak/>
+        <w:t>GET VÀ POST</w:t>
+      </w:r>
+    </w:p>
+    <w:p>
+      <w:pPr>
+        <w:rPr>
+          <w:b/>
+          <w:bCs/>
+          <w:color w:val="EE0000"/>
+        </w:rPr>
+      </w:pPr>
+      <w:r>
+        <w:rPr>
+          <w:b/>
+          <w:bCs/>
+          <w:color w:val="EE0000"/>
+        </w:rPr>
+        <w:t>Cách nhớ nhanh</w:t>
+      </w:r>
+    </w:p>
+    <w:tbl>
+      <w:tblPr>
+        <w:tblW w:w="0" w:type="auto"/>
+        <w:tblCellSpacing w:w="15" w:type="dxa"/>
+        <w:tblCellMar>
+          <w:top w:w="15" w:type="dxa"/>
+          <w:left w:w="15" w:type="dxa"/>
+          <w:bottom w:w="15" w:type="dxa"/>
+          <w:right w:w="15" w:type="dxa"/>
+        </w:tblCellMar>
+        <w:tblLook w:val="04A0" w:firstRow="1" w:lastRow="0" w:firstColumn="1" w:lastColumn="0" w:noHBand="0" w:noVBand="1"/>
+      </w:tblPr>
+      <w:tblGrid>
+        <w:gridCol w:w="874"/>
+        <w:gridCol w:w="1679"/>
+      </w:tblGrid>
+      <w:tr>
+        <w:trPr>
+          <w:tblHeader/>
+          <w:tblCellSpacing w:w="15" w:type="dxa"/>
+        </w:trPr>
+        <w:tc>
+          <w:tcPr>
+            <w:tcW w:w="0" w:type="auto"/>
+            <w:vAlign w:val="center"/>
+            <w:hideMark/>
+          </w:tcPr>
+          <w:p>
+            <w:pPr>
+              <w:rPr>
+                <w:b/>
+                <w:bCs/>
+              </w:rPr>
+            </w:pPr>
+            <w:r>
+              <w:rPr>
+                <w:b/>
+                <w:bCs/>
+              </w:rPr>
+              <w:t>Method</w:t>
+            </w:r>
+          </w:p>
+        </w:tc>
+        <w:tc>
+          <w:tcPr>
+            <w:tcW w:w="0" w:type="auto"/>
+            <w:vAlign w:val="center"/>
+            <w:hideMark/>
+          </w:tcPr>
+          <w:p>
+            <w:pPr>
+              <w:rPr>
+                <w:b/>
+                <w:bCs/>
+              </w:rPr>
+            </w:pPr>
+            <w:r>
+              <w:rPr>
+                <w:b/>
+                <w:bCs/>
+              </w:rPr>
+              <w:t>Mục đích</w:t>
+            </w:r>
+          </w:p>
+        </w:tc>
+      </w:tr>
+      <w:tr>
+        <w:trPr>
+          <w:tblCellSpacing w:w="15" w:type="dxa"/>
+        </w:trPr>
+        <w:tc>
+          <w:tcPr>
+            <w:tcW w:w="0" w:type="auto"/>
+            <w:vAlign w:val="center"/>
+            <w:hideMark/>
+          </w:tcPr>
+          <w:p>
+            <w:r>
+              <w:t>GET</w:t>
+            </w:r>
+          </w:p>
+        </w:tc>
+        <w:tc>
+          <w:tcPr>
+            <w:tcW w:w="0" w:type="auto"/>
+            <w:vAlign w:val="center"/>
+            <w:hideMark/>
+          </w:tcPr>
+          <w:p>
+            <w:r>
+              <w:t>Lấy dữ liệu</w:t>
+            </w:r>
+          </w:p>
+        </w:tc>
+      </w:tr>
+      <w:tr>
+        <w:trPr>
+          <w:tblCellSpacing w:w="15" w:type="dxa"/>
+        </w:trPr>
+        <w:tc>
+          <w:tcPr>
+            <w:tcW w:w="0" w:type="auto"/>
+            <w:vAlign w:val="center"/>
+            <w:hideMark/>
+          </w:tcPr>
+          <w:p>
+            <w:r>
+              <w:t>POST</w:t>
+            </w:r>
+          </w:p>
+        </w:tc>
+        <w:tc>
+          <w:tcPr>
+            <w:tcW w:w="0" w:type="auto"/>
+            <w:vAlign w:val="center"/>
+            <w:hideMark/>
+          </w:tcPr>
+          <w:p>
+            <w:r>
+              <w:t>Gửi dữ liệu mới</w:t>
+            </w:r>
+          </w:p>
+        </w:tc>
+      </w:tr>
+      <w:tr>
+        <w:trPr>
+          <w:tblCellSpacing w:w="15" w:type="dxa"/>
+        </w:trPr>
+        <w:tc>
+          <w:tcPr>
+            <w:tcW w:w="0" w:type="auto"/>
+            <w:vAlign w:val="center"/>
+            <w:hideMark/>
+          </w:tcPr>
+          <w:p>
+            <w:r>
+              <w:t>PUT</w:t>
+            </w:r>
+          </w:p>
+        </w:tc>
+        <w:tc>
+          <w:tcPr>
+            <w:tcW w:w="0" w:type="auto"/>
+            <w:vAlign w:val="center"/>
+            <w:hideMark/>
+          </w:tcPr>
+          <w:p>
+            <w:r>
+              <w:t>Cập nhật dữ liệu</w:t>
+            </w:r>
+          </w:p>
+        </w:tc>
+      </w:tr>
+      <w:tr>
+        <w:trPr>
+          <w:tblCellSpacing w:w="15" w:type="dxa"/>
+        </w:trPr>
+        <w:tc>
+          <w:tcPr>
+            <w:tcW w:w="0" w:type="auto"/>
+            <w:vAlign w:val="center"/>
+            <w:hideMark/>
+          </w:tcPr>
+          <w:p>
+            <w:r>
+              <w:t>DELETE</w:t>
+            </w:r>
+          </w:p>
+        </w:tc>
+        <w:tc>
+          <w:tcPr>
+            <w:tcW w:w="0" w:type="auto"/>
+            <w:vAlign w:val="center"/>
+            <w:hideMark/>
+          </w:tcPr>
+          <w:p>
+            <w:r>
+              <w:t>Xóa dữ liệu</w:t>
+            </w:r>
+          </w:p>
+        </w:tc>
+      </w:tr>
+    </w:tbl>
+    <w:p>
+      <w:r>
+        <w:t>Trong ASP.NET Core MVC:</w:t>
+      </w:r>
+    </w:p>
+    <w:p>
+      <w:pPr>
+        <w:numPr>
+          <w:ilvl w:val="0"/>
+          <w:numId w:val="3"/>
+        </w:numPr>
+      </w:pPr>
+      <w:r>
+        <w:t xml:space="preserve">Trang mở form → GET </w:t>
+      </w:r>
+    </w:p>
+    <w:p>
+      <w:pPr>
+        <w:numPr>
+          <w:ilvl w:val="0"/>
+          <w:numId w:val="3"/>
+        </w:numPr>
+      </w:pPr>
+      <w:r>
+        <w:t>Nhấn nút Save → POST</w:t>
+      </w:r>
+    </w:p>
+    <w:p>
+      <w:pPr>
+        <w:rPr>
+          <w:b/>
+          <w:bCs/>
+        </w:rPr>
+      </w:pPr>
+      <w:r>
+        <w:rPr>
+          <w:b/>
+          <w:bCs/>
+        </w:rPr>
+        <w:t>Tại sao Create phải dùng POST?</w:t>
+      </w:r>
+    </w:p>
+    <w:p>
+      <w:pPr>
+        <w:rPr>
+          <w:b/>
+          <w:bCs/>
+        </w:rPr>
+      </w:pPr>
+      <w:r>
+        <w:rPr>
+          <w:b/>
+          <w:bCs/>
+        </w:rPr>
+        <w:t>Vì Create là hành động thay đổi dữ liệu trong database.</w:t>
+      </w:r>
+    </w:p>
+    <w:p>
+      <w:r>
+        <w:drawing>
+          <wp:inline distT="0" distB="0" distL="0" distR="0" wp14:anchorId="6BEA33D3" wp14:editId="70AE708B">
+            <wp:extent cx="5943600" cy="3147060"/>
+            <wp:effectExtent l="0" t="0" r="0" b="0"/>
+            <wp:docPr id="1627236896" name="Picture 1"/>
+            <wp:cNvGraphicFramePr>
+              <a:graphicFrameLocks xmlns:a="http://schemas.openxmlformats.org/drawingml/2006/main" noChangeAspect="1"/>
+            </wp:cNvGraphicFramePr>
+            <a:graphic xmlns:a="http://schemas.openxmlformats.org/drawingml/2006/main">
+              <a:graphicData uri="http://schemas.openxmlformats.org/drawingml/2006/picture">
+                <pic:pic xmlns:pic="http://schemas.openxmlformats.org/drawingml/2006/picture">
+                  <pic:nvPicPr>
+                    <pic:cNvPr id="1627236896" name=""/>
+                    <pic:cNvPicPr/>
+                  </pic:nvPicPr>
+                  <pic:blipFill>
+                    <a:blip r:embed="rId20"/>
+                    <a:stretch>
+                      <a:fillRect/>
+                    </a:stretch>
+                  </pic:blipFill>
+                  <pic:spPr>
+                    <a:xfrm>
+                      <a:off x="0" y="0"/>
+                      <a:ext cx="5943600" cy="3147060"/>
+                    </a:xfrm>
+                    <a:prstGeom prst="rect">
+                      <a:avLst/>
+                    </a:prstGeom>
+                  </pic:spPr>
+                </pic:pic>
+              </a:graphicData>
+            </a:graphic>
+          </wp:inline>
+        </w:drawing>
+      </w:r>
+    </w:p>
+    <w:p>
+      <w:pPr>
+        <w:rPr>
+          <w:color w:val="EE0000"/>
+        </w:rPr>
+      </w:pPr>
+    </w:p>
+    <w:p/>
     <w:p/>
     <w:sectPr>
       <w:pgSz w:w="12240" w:h="15840"/>
@@ -3480,6 +5027,155 @@
     </w:lvl>
   </w:abstractNum>
   <w:abstractNum w:abstractNumId="1" w15:restartNumberingAfterBreak="0">
+    <w:nsid w:val="3A48159F"/>
+    <w:multiLevelType w:val="multilevel"/>
+    <w:tmpl w:val="3BC43E3E"/>
+    <w:lvl w:ilvl="0">
+      <w:start w:val="1"/>
+      <w:numFmt w:val="bullet"/>
+      <w:lvlText w:val=""/>
+      <w:lvlJc w:val="left"/>
+      <w:pPr>
+        <w:tabs>
+          <w:tab w:val="num" w:pos="720"/>
+        </w:tabs>
+        <w:ind w:left="720" w:hanging="360"/>
+      </w:pPr>
+      <w:rPr>
+        <w:rFonts w:ascii="Symbol" w:hAnsi="Symbol" w:hint="default"/>
+        <w:sz w:val="20"/>
+      </w:rPr>
+    </w:lvl>
+    <w:lvl w:ilvl="1" w:tentative="1">
+      <w:start w:val="1"/>
+      <w:numFmt w:val="bullet"/>
+      <w:lvlText w:val="o"/>
+      <w:lvlJc w:val="left"/>
+      <w:pPr>
+        <w:tabs>
+          <w:tab w:val="num" w:pos="1440"/>
+        </w:tabs>
+        <w:ind w:left="1440" w:hanging="360"/>
+      </w:pPr>
+      <w:rPr>
+        <w:rFonts w:ascii="Courier New" w:hAnsi="Courier New" w:hint="default"/>
+        <w:sz w:val="20"/>
+      </w:rPr>
+    </w:lvl>
+    <w:lvl w:ilvl="2" w:tentative="1">
+      <w:start w:val="1"/>
+      <w:numFmt w:val="bullet"/>
+      <w:lvlText w:val=""/>
+      <w:lvlJc w:val="left"/>
+      <w:pPr>
+        <w:tabs>
+          <w:tab w:val="num" w:pos="2160"/>
+        </w:tabs>
+        <w:ind w:left="2160" w:hanging="360"/>
+      </w:pPr>
+      <w:rPr>
+        <w:rFonts w:ascii="Wingdings" w:hAnsi="Wingdings" w:hint="default"/>
+        <w:sz w:val="20"/>
+      </w:rPr>
+    </w:lvl>
+    <w:lvl w:ilvl="3" w:tentative="1">
+      <w:start w:val="1"/>
+      <w:numFmt w:val="bullet"/>
+      <w:lvlText w:val=""/>
+      <w:lvlJc w:val="left"/>
+      <w:pPr>
+        <w:tabs>
+          <w:tab w:val="num" w:pos="2880"/>
+        </w:tabs>
+        <w:ind w:left="2880" w:hanging="360"/>
+      </w:pPr>
+      <w:rPr>
+        <w:rFonts w:ascii="Wingdings" w:hAnsi="Wingdings" w:hint="default"/>
+        <w:sz w:val="20"/>
+      </w:rPr>
+    </w:lvl>
+    <w:lvl w:ilvl="4" w:tentative="1">
+      <w:start w:val="1"/>
+      <w:numFmt w:val="bullet"/>
+      <w:lvlText w:val=""/>
+      <w:lvlJc w:val="left"/>
+      <w:pPr>
+        <w:tabs>
+          <w:tab w:val="num" w:pos="3600"/>
+        </w:tabs>
+        <w:ind w:left="3600" w:hanging="360"/>
+      </w:pPr>
+      <w:rPr>
+        <w:rFonts w:ascii="Wingdings" w:hAnsi="Wingdings" w:hint="default"/>
+        <w:sz w:val="20"/>
+      </w:rPr>
+    </w:lvl>
+    <w:lvl w:ilvl="5" w:tentative="1">
+      <w:start w:val="1"/>
+      <w:numFmt w:val="bullet"/>
+      <w:lvlText w:val=""/>
+      <w:lvlJc w:val="left"/>
+      <w:pPr>
+        <w:tabs>
+          <w:tab w:val="num" w:pos="4320"/>
+        </w:tabs>
+        <w:ind w:left="4320" w:hanging="360"/>
+      </w:pPr>
+      <w:rPr>
+        <w:rFonts w:ascii="Wingdings" w:hAnsi="Wingdings" w:hint="default"/>
+        <w:sz w:val="20"/>
+      </w:rPr>
+    </w:lvl>
+    <w:lvl w:ilvl="6" w:tentative="1">
+      <w:start w:val="1"/>
+      <w:numFmt w:val="bullet"/>
+      <w:lvlText w:val=""/>
+      <w:lvlJc w:val="left"/>
+      <w:pPr>
+        <w:tabs>
+          <w:tab w:val="num" w:pos="5040"/>
+        </w:tabs>
+        <w:ind w:left="5040" w:hanging="360"/>
+      </w:pPr>
+      <w:rPr>
+        <w:rFonts w:ascii="Wingdings" w:hAnsi="Wingdings" w:hint="default"/>
+        <w:sz w:val="20"/>
+      </w:rPr>
+    </w:lvl>
+    <w:lvl w:ilvl="7" w:tentative="1">
+      <w:start w:val="1"/>
+      <w:numFmt w:val="bullet"/>
+      <w:lvlText w:val=""/>
+      <w:lvlJc w:val="left"/>
+      <w:pPr>
+        <w:tabs>
+          <w:tab w:val="num" w:pos="5760"/>
+        </w:tabs>
+        <w:ind w:left="5760" w:hanging="360"/>
+      </w:pPr>
+      <w:rPr>
+        <w:rFonts w:ascii="Wingdings" w:hAnsi="Wingdings" w:hint="default"/>
+        <w:sz w:val="20"/>
+      </w:rPr>
+    </w:lvl>
+    <w:lvl w:ilvl="8" w:tentative="1">
+      <w:start w:val="1"/>
+      <w:numFmt w:val="bullet"/>
+      <w:lvlText w:val=""/>
+      <w:lvlJc w:val="left"/>
+      <w:pPr>
+        <w:tabs>
+          <w:tab w:val="num" w:pos="6480"/>
+        </w:tabs>
+        <w:ind w:left="6480" w:hanging="360"/>
+      </w:pPr>
+      <w:rPr>
+        <w:rFonts w:ascii="Wingdings" w:hAnsi="Wingdings" w:hint="default"/>
+        <w:sz w:val="20"/>
+      </w:rPr>
+    </w:lvl>
+  </w:abstractNum>
+  <w:abstractNum w:abstractNumId="2" w15:restartNumberingAfterBreak="0">
     <w:nsid w:val="73B52B43"/>
     <w:multiLevelType w:val="multilevel"/>
     <w:tmpl w:val="59884D7E"/>
@@ -3597,10 +5293,13 @@
     </w:lvl>
   </w:abstractNum>
   <w:num w:numId="1" w16cid:durableId="430272983">
-    <w:abstractNumId w:val="1"/>
+    <w:abstractNumId w:val="2"/>
   </w:num>
   <w:num w:numId="2" w16cid:durableId="301925985">
     <w:abstractNumId w:val="0"/>
+  </w:num>
+  <w:num w:numId="3" w16cid:durableId="553927071">
+    <w:abstractNumId w:val="1"/>
   </w:num>
 </w:numbering>
 </file>

</xml_diff>

<commit_message>
feat: One to One Relationships
</commit_message>
<xml_diff>
--- a/MyApp/hihi.docx
+++ b/MyApp/hihi.docx
@@ -4704,6 +4704,9 @@
     </w:p>
     <w:p>
       <w:r>
+        <w:rPr>
+          <w:noProof/>
+        </w:rPr>
         <w:drawing>
           <wp:inline distT="0" distB="0" distL="0" distR="0" wp14:anchorId="21841A19" wp14:editId="63E9F052">
             <wp:extent cx="5543154" cy="3742221"/>
@@ -4748,6 +4751,9 @@
         </w:rPr>
       </w:pPr>
       <w:r>
+        <w:rPr>
+          <w:noProof/>
+        </w:rPr>
         <w:drawing>
           <wp:inline distT="0" distB="0" distL="0" distR="0" wp14:anchorId="20B55F52" wp14:editId="691684FC">
             <wp:extent cx="4814542" cy="3832087"/>
@@ -5119,8 +5125,1019 @@
         </w:rPr>
       </w:pPr>
     </w:p>
-    <w:p/>
-    <w:p/>
+    <w:p>
+      <w:r>
+        <w:br w:type="page"/>
+      </w:r>
+    </w:p>
+    <w:p>
+      <w:pPr>
+        <w:jc w:val="center"/>
+        <w:rPr>
+          <w:b/>
+          <w:bCs/>
+          <w:color w:val="EE0000"/>
+          <w:sz w:val="32"/>
+          <w:szCs w:val="32"/>
+        </w:rPr>
+      </w:pPr>
+      <w:r>
+        <w:rPr>
+          <w:b/>
+          <w:bCs/>
+          <w:color w:val="EE0000"/>
+          <w:sz w:val="32"/>
+          <w:szCs w:val="32"/>
+        </w:rPr>
+        <w:lastRenderedPageBreak/>
+        <w:t>QUAN TRỌNG</w:t>
+      </w:r>
+    </w:p>
+    <w:p>
+      <w:r>
+        <w:rPr>
+          <w:noProof/>
+        </w:rPr>
+        <w:drawing>
+          <wp:inline distT="0" distB="0" distL="0" distR="0" wp14:anchorId="082A574F" wp14:editId="275335EC">
+            <wp:extent cx="5943600" cy="6227445"/>
+            <wp:effectExtent l="0" t="0" r="0" b="1905"/>
+            <wp:docPr id="158878963" name="Picture 1"/>
+            <wp:cNvGraphicFramePr>
+              <a:graphicFrameLocks xmlns:a="http://schemas.openxmlformats.org/drawingml/2006/main" noChangeAspect="1"/>
+            </wp:cNvGraphicFramePr>
+            <a:graphic xmlns:a="http://schemas.openxmlformats.org/drawingml/2006/main">
+              <a:graphicData uri="http://schemas.openxmlformats.org/drawingml/2006/picture">
+                <pic:pic xmlns:pic="http://schemas.openxmlformats.org/drawingml/2006/picture">
+                  <pic:nvPicPr>
+                    <pic:cNvPr id="158878963" name=""/>
+                    <pic:cNvPicPr/>
+                  </pic:nvPicPr>
+                  <pic:blipFill>
+                    <a:blip r:embed="rId25"/>
+                    <a:stretch>
+                      <a:fillRect/>
+                    </a:stretch>
+                  </pic:blipFill>
+                  <pic:spPr>
+                    <a:xfrm>
+                      <a:off x="0" y="0"/>
+                      <a:ext cx="5943600" cy="6227445"/>
+                    </a:xfrm>
+                    <a:prstGeom prst="rect">
+                      <a:avLst/>
+                    </a:prstGeom>
+                  </pic:spPr>
+                </pic:pic>
+              </a:graphicData>
+            </a:graphic>
+          </wp:inline>
+        </w:drawing>
+      </w:r>
+    </w:p>
+    <w:p>
+      <w:r>
+        <w:rPr>
+          <w:noProof/>
+        </w:rPr>
+        <w:lastRenderedPageBreak/>
+        <w:drawing>
+          <wp:inline distT="0" distB="0" distL="0" distR="0" wp14:anchorId="290BE8A9" wp14:editId="09560E50">
+            <wp:extent cx="5943600" cy="3450590"/>
+            <wp:effectExtent l="0" t="0" r="0" b="0"/>
+            <wp:docPr id="805183998" name="Picture 1"/>
+            <wp:cNvGraphicFramePr>
+              <a:graphicFrameLocks xmlns:a="http://schemas.openxmlformats.org/drawingml/2006/main" noChangeAspect="1"/>
+            </wp:cNvGraphicFramePr>
+            <a:graphic xmlns:a="http://schemas.openxmlformats.org/drawingml/2006/main">
+              <a:graphicData uri="http://schemas.openxmlformats.org/drawingml/2006/picture">
+                <pic:pic xmlns:pic="http://schemas.openxmlformats.org/drawingml/2006/picture">
+                  <pic:nvPicPr>
+                    <pic:cNvPr id="805183998" name=""/>
+                    <pic:cNvPicPr/>
+                  </pic:nvPicPr>
+                  <pic:blipFill>
+                    <a:blip r:embed="rId26"/>
+                    <a:stretch>
+                      <a:fillRect/>
+                    </a:stretch>
+                  </pic:blipFill>
+                  <pic:spPr>
+                    <a:xfrm>
+                      <a:off x="0" y="0"/>
+                      <a:ext cx="5943600" cy="3450590"/>
+                    </a:xfrm>
+                    <a:prstGeom prst="rect">
+                      <a:avLst/>
+                    </a:prstGeom>
+                  </pic:spPr>
+                </pic:pic>
+              </a:graphicData>
+            </a:graphic>
+          </wp:inline>
+        </w:drawing>
+      </w:r>
+    </w:p>
+    <w:p>
+      <w:r>
+        <w:br w:type="page"/>
+      </w:r>
+    </w:p>
+    <w:p>
+      <w:pPr>
+        <w:jc w:val="center"/>
+        <w:rPr>
+          <w:b/>
+          <w:bCs/>
+          <w:sz w:val="32"/>
+          <w:szCs w:val="32"/>
+        </w:rPr>
+      </w:pPr>
+      <w:r>
+        <w:rPr>
+          <w:b/>
+          <w:bCs/>
+          <w:sz w:val="32"/>
+          <w:szCs w:val="32"/>
+        </w:rPr>
+        <w:lastRenderedPageBreak/>
+        <w:t>NULL</w:t>
+      </w:r>
+    </w:p>
+    <w:p>
+      <w:r>
+        <w:drawing>
+          <wp:inline distT="0" distB="0" distL="0" distR="0" wp14:anchorId="0829B020" wp14:editId="2B3334DD">
+            <wp:extent cx="5943600" cy="2129155"/>
+            <wp:effectExtent l="0" t="0" r="0" b="4445"/>
+            <wp:docPr id="1420821055" name="Picture 1"/>
+            <wp:cNvGraphicFramePr>
+              <a:graphicFrameLocks xmlns:a="http://schemas.openxmlformats.org/drawingml/2006/main" noChangeAspect="1"/>
+            </wp:cNvGraphicFramePr>
+            <a:graphic xmlns:a="http://schemas.openxmlformats.org/drawingml/2006/main">
+              <a:graphicData uri="http://schemas.openxmlformats.org/drawingml/2006/picture">
+                <pic:pic xmlns:pic="http://schemas.openxmlformats.org/drawingml/2006/picture">
+                  <pic:nvPicPr>
+                    <pic:cNvPr id="1420821055" name=""/>
+                    <pic:cNvPicPr/>
+                  </pic:nvPicPr>
+                  <pic:blipFill>
+                    <a:blip r:embed="rId27"/>
+                    <a:stretch>
+                      <a:fillRect/>
+                    </a:stretch>
+                  </pic:blipFill>
+                  <pic:spPr>
+                    <a:xfrm>
+                      <a:off x="0" y="0"/>
+                      <a:ext cx="5943600" cy="2129155"/>
+                    </a:xfrm>
+                    <a:prstGeom prst="rect">
+                      <a:avLst/>
+                    </a:prstGeom>
+                  </pic:spPr>
+                </pic:pic>
+              </a:graphicData>
+            </a:graphic>
+          </wp:inline>
+        </w:drawing>
+      </w:r>
+    </w:p>
+    <w:p>
+      <w:r>
+        <w:br w:type="page"/>
+      </w:r>
+    </w:p>
+    <w:p>
+      <w:pPr>
+        <w:jc w:val="center"/>
+        <w:rPr>
+          <w:b/>
+          <w:bCs/>
+          <w:sz w:val="32"/>
+          <w:szCs w:val="32"/>
+        </w:rPr>
+      </w:pPr>
+      <w:r>
+        <w:rPr>
+          <w:b/>
+          <w:bCs/>
+          <w:sz w:val="32"/>
+          <w:szCs w:val="32"/>
+        </w:rPr>
+        <w:lastRenderedPageBreak/>
+        <w:t>Quan hệ 1-1 hoặc N-1 và Quan hệ 1-N hoặc N-N</w:t>
+      </w:r>
+    </w:p>
+    <w:p>
+      <w:r>
+        <w:drawing>
+          <wp:inline distT="0" distB="0" distL="0" distR="0" wp14:anchorId="7058A13B" wp14:editId="75CCA67F">
+            <wp:extent cx="4136334" cy="3586149"/>
+            <wp:effectExtent l="0" t="0" r="0" b="0"/>
+            <wp:docPr id="57534107" name="Picture 1"/>
+            <wp:cNvGraphicFramePr>
+              <a:graphicFrameLocks xmlns:a="http://schemas.openxmlformats.org/drawingml/2006/main" noChangeAspect="1"/>
+            </wp:cNvGraphicFramePr>
+            <a:graphic xmlns:a="http://schemas.openxmlformats.org/drawingml/2006/main">
+              <a:graphicData uri="http://schemas.openxmlformats.org/drawingml/2006/picture">
+                <pic:pic xmlns:pic="http://schemas.openxmlformats.org/drawingml/2006/picture">
+                  <pic:nvPicPr>
+                    <pic:cNvPr id="57534107" name=""/>
+                    <pic:cNvPicPr/>
+                  </pic:nvPicPr>
+                  <pic:blipFill>
+                    <a:blip r:embed="rId28"/>
+                    <a:stretch>
+                      <a:fillRect/>
+                    </a:stretch>
+                  </pic:blipFill>
+                  <pic:spPr>
+                    <a:xfrm>
+                      <a:off x="0" y="0"/>
+                      <a:ext cx="4152335" cy="3600022"/>
+                    </a:xfrm>
+                    <a:prstGeom prst="rect">
+                      <a:avLst/>
+                    </a:prstGeom>
+                  </pic:spPr>
+                </pic:pic>
+              </a:graphicData>
+            </a:graphic>
+          </wp:inline>
+        </w:drawing>
+      </w:r>
+    </w:p>
+    <w:p>
+      <w:r>
+        <w:drawing>
+          <wp:inline distT="0" distB="0" distL="0" distR="0" wp14:anchorId="4CF4656A" wp14:editId="1DA7E333">
+            <wp:extent cx="3923152" cy="4090918"/>
+            <wp:effectExtent l="0" t="0" r="1270" b="5080"/>
+            <wp:docPr id="1362859197" name="Picture 1"/>
+            <wp:cNvGraphicFramePr>
+              <a:graphicFrameLocks xmlns:a="http://schemas.openxmlformats.org/drawingml/2006/main" noChangeAspect="1"/>
+            </wp:cNvGraphicFramePr>
+            <a:graphic xmlns:a="http://schemas.openxmlformats.org/drawingml/2006/main">
+              <a:graphicData uri="http://schemas.openxmlformats.org/drawingml/2006/picture">
+                <pic:pic xmlns:pic="http://schemas.openxmlformats.org/drawingml/2006/picture">
+                  <pic:nvPicPr>
+                    <pic:cNvPr id="1362859197" name=""/>
+                    <pic:cNvPicPr/>
+                  </pic:nvPicPr>
+                  <pic:blipFill>
+                    <a:blip r:embed="rId29"/>
+                    <a:stretch>
+                      <a:fillRect/>
+                    </a:stretch>
+                  </pic:blipFill>
+                  <pic:spPr>
+                    <a:xfrm>
+                      <a:off x="0" y="0"/>
+                      <a:ext cx="3926933" cy="4094860"/>
+                    </a:xfrm>
+                    <a:prstGeom prst="rect">
+                      <a:avLst/>
+                    </a:prstGeom>
+                  </pic:spPr>
+                </pic:pic>
+              </a:graphicData>
+            </a:graphic>
+          </wp:inline>
+        </w:drawing>
+      </w:r>
+    </w:p>
+    <w:p>
+      <w:r>
+        <w:lastRenderedPageBreak/>
+        <w:drawing>
+          <wp:inline distT="0" distB="0" distL="0" distR="0" wp14:anchorId="71217354" wp14:editId="3908DE6D">
+            <wp:extent cx="4882639" cy="4642509"/>
+            <wp:effectExtent l="0" t="0" r="0" b="5715"/>
+            <wp:docPr id="1634339140" name="Picture 1"/>
+            <wp:cNvGraphicFramePr>
+              <a:graphicFrameLocks xmlns:a="http://schemas.openxmlformats.org/drawingml/2006/main" noChangeAspect="1"/>
+            </wp:cNvGraphicFramePr>
+            <a:graphic xmlns:a="http://schemas.openxmlformats.org/drawingml/2006/main">
+              <a:graphicData uri="http://schemas.openxmlformats.org/drawingml/2006/picture">
+                <pic:pic xmlns:pic="http://schemas.openxmlformats.org/drawingml/2006/picture">
+                  <pic:nvPicPr>
+                    <pic:cNvPr id="1634339140" name=""/>
+                    <pic:cNvPicPr/>
+                  </pic:nvPicPr>
+                  <pic:blipFill>
+                    <a:blip r:embed="rId30"/>
+                    <a:stretch>
+                      <a:fillRect/>
+                    </a:stretch>
+                  </pic:blipFill>
+                  <pic:spPr>
+                    <a:xfrm>
+                      <a:off x="0" y="0"/>
+                      <a:ext cx="4886547" cy="4646225"/>
+                    </a:xfrm>
+                    <a:prstGeom prst="rect">
+                      <a:avLst/>
+                    </a:prstGeom>
+                  </pic:spPr>
+                </pic:pic>
+              </a:graphicData>
+            </a:graphic>
+          </wp:inline>
+        </w:drawing>
+      </w:r>
+    </w:p>
+    <w:p>
+      <w:r>
+        <w:drawing>
+          <wp:inline distT="0" distB="0" distL="0" distR="0" wp14:anchorId="6622B425" wp14:editId="5FC4DA59">
+            <wp:extent cx="3997435" cy="2213113"/>
+            <wp:effectExtent l="0" t="0" r="3175" b="0"/>
+            <wp:docPr id="2034570501" name="Picture 1"/>
+            <wp:cNvGraphicFramePr>
+              <a:graphicFrameLocks xmlns:a="http://schemas.openxmlformats.org/drawingml/2006/main" noChangeAspect="1"/>
+            </wp:cNvGraphicFramePr>
+            <a:graphic xmlns:a="http://schemas.openxmlformats.org/drawingml/2006/main">
+              <a:graphicData uri="http://schemas.openxmlformats.org/drawingml/2006/picture">
+                <pic:pic xmlns:pic="http://schemas.openxmlformats.org/drawingml/2006/picture">
+                  <pic:nvPicPr>
+                    <pic:cNvPr id="2034570501" name=""/>
+                    <pic:cNvPicPr/>
+                  </pic:nvPicPr>
+                  <pic:blipFill>
+                    <a:blip r:embed="rId31"/>
+                    <a:stretch>
+                      <a:fillRect/>
+                    </a:stretch>
+                  </pic:blipFill>
+                  <pic:spPr>
+                    <a:xfrm>
+                      <a:off x="0" y="0"/>
+                      <a:ext cx="3998242" cy="2213560"/>
+                    </a:xfrm>
+                    <a:prstGeom prst="rect">
+                      <a:avLst/>
+                    </a:prstGeom>
+                  </pic:spPr>
+                </pic:pic>
+              </a:graphicData>
+            </a:graphic>
+          </wp:inline>
+        </w:drawing>
+      </w:r>
+    </w:p>
+    <w:p>
+      <w:r>
+        <w:br w:type="page"/>
+      </w:r>
+    </w:p>
+    <w:p>
+      <w:pPr>
+        <w:jc w:val="center"/>
+        <w:rPr>
+          <w:b/>
+          <w:bCs/>
+          <w:sz w:val="32"/>
+          <w:szCs w:val="32"/>
+        </w:rPr>
+      </w:pPr>
+      <w:r>
+        <w:rPr>
+          <w:b/>
+          <w:bCs/>
+          <w:sz w:val="32"/>
+          <w:szCs w:val="32"/>
+        </w:rPr>
+        <w:lastRenderedPageBreak/>
+        <w:t>Làm sao để nhận biết các quan hệ trên?</w:t>
+      </w:r>
+    </w:p>
+    <w:p>
+      <w:pPr>
+        <w:rPr>
+          <w:b/>
+          <w:bCs/>
+        </w:rPr>
+      </w:pPr>
+      <w:r>
+        <w:rPr>
+          <w:b/>
+          <w:bCs/>
+        </w:rPr>
+        <w:drawing>
+          <wp:inline distT="0" distB="0" distL="0" distR="0" wp14:anchorId="68F89D6C" wp14:editId="13BF6363">
+            <wp:extent cx="4350837" cy="5140491"/>
+            <wp:effectExtent l="0" t="0" r="0" b="3175"/>
+            <wp:docPr id="22804576" name="Picture 1"/>
+            <wp:cNvGraphicFramePr>
+              <a:graphicFrameLocks xmlns:a="http://schemas.openxmlformats.org/drawingml/2006/main" noChangeAspect="1"/>
+            </wp:cNvGraphicFramePr>
+            <a:graphic xmlns:a="http://schemas.openxmlformats.org/drawingml/2006/main">
+              <a:graphicData uri="http://schemas.openxmlformats.org/drawingml/2006/picture">
+                <pic:pic xmlns:pic="http://schemas.openxmlformats.org/drawingml/2006/picture">
+                  <pic:nvPicPr>
+                    <pic:cNvPr id="22804576" name=""/>
+                    <pic:cNvPicPr/>
+                  </pic:nvPicPr>
+                  <pic:blipFill>
+                    <a:blip r:embed="rId32"/>
+                    <a:stretch>
+                      <a:fillRect/>
+                    </a:stretch>
+                  </pic:blipFill>
+                  <pic:spPr>
+                    <a:xfrm>
+                      <a:off x="0" y="0"/>
+                      <a:ext cx="4356743" cy="5147468"/>
+                    </a:xfrm>
+                    <a:prstGeom prst="rect">
+                      <a:avLst/>
+                    </a:prstGeom>
+                  </pic:spPr>
+                </pic:pic>
+              </a:graphicData>
+            </a:graphic>
+          </wp:inline>
+        </w:drawing>
+      </w:r>
+    </w:p>
+    <w:p>
+      <w:pPr>
+        <w:rPr>
+          <w:b/>
+          <w:bCs/>
+        </w:rPr>
+      </w:pPr>
+      <w:r>
+        <w:rPr>
+          <w:b/>
+          <w:bCs/>
+        </w:rPr>
+        <w:drawing>
+          <wp:inline distT="0" distB="0" distL="0" distR="0" wp14:anchorId="3B12D7D8" wp14:editId="6D4F2D78">
+            <wp:extent cx="4974905" cy="1674247"/>
+            <wp:effectExtent l="0" t="0" r="0" b="2540"/>
+            <wp:docPr id="1496861595" name="Picture 1"/>
+            <wp:cNvGraphicFramePr>
+              <a:graphicFrameLocks xmlns:a="http://schemas.openxmlformats.org/drawingml/2006/main" noChangeAspect="1"/>
+            </wp:cNvGraphicFramePr>
+            <a:graphic xmlns:a="http://schemas.openxmlformats.org/drawingml/2006/main">
+              <a:graphicData uri="http://schemas.openxmlformats.org/drawingml/2006/picture">
+                <pic:pic xmlns:pic="http://schemas.openxmlformats.org/drawingml/2006/picture">
+                  <pic:nvPicPr>
+                    <pic:cNvPr id="1496861595" name=""/>
+                    <pic:cNvPicPr/>
+                  </pic:nvPicPr>
+                  <pic:blipFill>
+                    <a:blip r:embed="rId33"/>
+                    <a:stretch>
+                      <a:fillRect/>
+                    </a:stretch>
+                  </pic:blipFill>
+                  <pic:spPr>
+                    <a:xfrm>
+                      <a:off x="0" y="0"/>
+                      <a:ext cx="4985287" cy="1677741"/>
+                    </a:xfrm>
+                    <a:prstGeom prst="rect">
+                      <a:avLst/>
+                    </a:prstGeom>
+                  </pic:spPr>
+                </pic:pic>
+              </a:graphicData>
+            </a:graphic>
+          </wp:inline>
+        </w:drawing>
+      </w:r>
+    </w:p>
+    <w:p>
+      <w:pPr>
+        <w:rPr>
+          <w:b/>
+          <w:bCs/>
+        </w:rPr>
+      </w:pPr>
+    </w:p>
+    <w:p>
+      <w:pPr>
+        <w:rPr>
+          <w:b/>
+          <w:bCs/>
+        </w:rPr>
+      </w:pPr>
+    </w:p>
+    <w:p>
+      <w:pPr>
+        <w:jc w:val="center"/>
+        <w:rPr>
+          <w:b/>
+          <w:bCs/>
+          <w:sz w:val="32"/>
+          <w:szCs w:val="32"/>
+        </w:rPr>
+      </w:pPr>
+      <w:r>
+        <w:rPr>
+          <w:b/>
+          <w:bCs/>
+          <w:sz w:val="32"/>
+          <w:szCs w:val="32"/>
+        </w:rPr>
+        <w:lastRenderedPageBreak/>
+        <w:t>Dễ hiểu hơn</w:t>
+      </w:r>
+    </w:p>
+    <w:p>
+      <w:pPr>
+        <w:rPr>
+          <w:b/>
+          <w:bCs/>
+        </w:rPr>
+      </w:pPr>
+      <w:r>
+        <w:rPr>
+          <w:b/>
+          <w:bCs/>
+        </w:rPr>
+        <w:drawing>
+          <wp:inline distT="0" distB="0" distL="0" distR="0" wp14:anchorId="1F2A3695" wp14:editId="6CFD7F34">
+            <wp:extent cx="4428490" cy="3140723"/>
+            <wp:effectExtent l="0" t="0" r="0" b="2540"/>
+            <wp:docPr id="1585456193" name="Picture 1"/>
+            <wp:cNvGraphicFramePr>
+              <a:graphicFrameLocks xmlns:a="http://schemas.openxmlformats.org/drawingml/2006/main" noChangeAspect="1"/>
+            </wp:cNvGraphicFramePr>
+            <a:graphic xmlns:a="http://schemas.openxmlformats.org/drawingml/2006/main">
+              <a:graphicData uri="http://schemas.openxmlformats.org/drawingml/2006/picture">
+                <pic:pic xmlns:pic="http://schemas.openxmlformats.org/drawingml/2006/picture">
+                  <pic:nvPicPr>
+                    <pic:cNvPr id="1585456193" name=""/>
+                    <pic:cNvPicPr/>
+                  </pic:nvPicPr>
+                  <pic:blipFill>
+                    <a:blip r:embed="rId34"/>
+                    <a:stretch>
+                      <a:fillRect/>
+                    </a:stretch>
+                  </pic:blipFill>
+                  <pic:spPr>
+                    <a:xfrm>
+                      <a:off x="0" y="0"/>
+                      <a:ext cx="4447840" cy="3154446"/>
+                    </a:xfrm>
+                    <a:prstGeom prst="rect">
+                      <a:avLst/>
+                    </a:prstGeom>
+                  </pic:spPr>
+                </pic:pic>
+              </a:graphicData>
+            </a:graphic>
+          </wp:inline>
+        </w:drawing>
+      </w:r>
+    </w:p>
+    <w:p>
+      <w:pPr>
+        <w:rPr>
+          <w:b/>
+          <w:bCs/>
+        </w:rPr>
+      </w:pPr>
+      <w:r>
+        <w:rPr>
+          <w:b/>
+          <w:bCs/>
+        </w:rPr>
+        <w:drawing>
+          <wp:inline distT="0" distB="0" distL="0" distR="0" wp14:anchorId="41721A22" wp14:editId="6E6EDBE9">
+            <wp:extent cx="4428877" cy="3137122"/>
+            <wp:effectExtent l="0" t="0" r="0" b="6350"/>
+            <wp:docPr id="10454569" name="Picture 1"/>
+            <wp:cNvGraphicFramePr>
+              <a:graphicFrameLocks xmlns:a="http://schemas.openxmlformats.org/drawingml/2006/main" noChangeAspect="1"/>
+            </wp:cNvGraphicFramePr>
+            <a:graphic xmlns:a="http://schemas.openxmlformats.org/drawingml/2006/main">
+              <a:graphicData uri="http://schemas.openxmlformats.org/drawingml/2006/picture">
+                <pic:pic xmlns:pic="http://schemas.openxmlformats.org/drawingml/2006/picture">
+                  <pic:nvPicPr>
+                    <pic:cNvPr id="10454569" name=""/>
+                    <pic:cNvPicPr/>
+                  </pic:nvPicPr>
+                  <pic:blipFill>
+                    <a:blip r:embed="rId35"/>
+                    <a:stretch>
+                      <a:fillRect/>
+                    </a:stretch>
+                  </pic:blipFill>
+                  <pic:spPr>
+                    <a:xfrm>
+                      <a:off x="0" y="0"/>
+                      <a:ext cx="4455995" cy="3156331"/>
+                    </a:xfrm>
+                    <a:prstGeom prst="rect">
+                      <a:avLst/>
+                    </a:prstGeom>
+                  </pic:spPr>
+                </pic:pic>
+              </a:graphicData>
+            </a:graphic>
+          </wp:inline>
+        </w:drawing>
+      </w:r>
+    </w:p>
+    <w:p>
+      <w:pPr>
+        <w:rPr>
+          <w:b/>
+          <w:bCs/>
+        </w:rPr>
+      </w:pPr>
+      <w:r>
+        <w:rPr>
+          <w:b/>
+          <w:bCs/>
+        </w:rPr>
+        <w:lastRenderedPageBreak/>
+        <w:drawing>
+          <wp:inline distT="0" distB="0" distL="0" distR="0" wp14:anchorId="6A4ED99B" wp14:editId="47B735A9">
+            <wp:extent cx="3927944" cy="3728191"/>
+            <wp:effectExtent l="0" t="0" r="0" b="5715"/>
+            <wp:docPr id="881521225" name="Picture 1"/>
+            <wp:cNvGraphicFramePr>
+              <a:graphicFrameLocks xmlns:a="http://schemas.openxmlformats.org/drawingml/2006/main" noChangeAspect="1"/>
+            </wp:cNvGraphicFramePr>
+            <a:graphic xmlns:a="http://schemas.openxmlformats.org/drawingml/2006/main">
+              <a:graphicData uri="http://schemas.openxmlformats.org/drawingml/2006/picture">
+                <pic:pic xmlns:pic="http://schemas.openxmlformats.org/drawingml/2006/picture">
+                  <pic:nvPicPr>
+                    <pic:cNvPr id="881521225" name=""/>
+                    <pic:cNvPicPr/>
+                  </pic:nvPicPr>
+                  <pic:blipFill>
+                    <a:blip r:embed="rId36"/>
+                    <a:stretch>
+                      <a:fillRect/>
+                    </a:stretch>
+                  </pic:blipFill>
+                  <pic:spPr>
+                    <a:xfrm>
+                      <a:off x="0" y="0"/>
+                      <a:ext cx="3933301" cy="3733275"/>
+                    </a:xfrm>
+                    <a:prstGeom prst="rect">
+                      <a:avLst/>
+                    </a:prstGeom>
+                  </pic:spPr>
+                </pic:pic>
+              </a:graphicData>
+            </a:graphic>
+          </wp:inline>
+        </w:drawing>
+      </w:r>
+    </w:p>
+    <w:p>
+      <w:pPr>
+        <w:rPr>
+          <w:b/>
+          <w:bCs/>
+        </w:rPr>
+      </w:pPr>
+    </w:p>
+    <w:p>
+      <w:pPr>
+        <w:jc w:val="center"/>
+        <w:rPr>
+          <w:b/>
+          <w:bCs/>
+          <w:sz w:val="32"/>
+          <w:szCs w:val="32"/>
+        </w:rPr>
+      </w:pPr>
+      <w:r>
+        <w:rPr>
+          <w:b/>
+          <w:bCs/>
+          <w:sz w:val="32"/>
+          <w:szCs w:val="32"/>
+        </w:rPr>
+        <w:t>Trong dự án MyApp</w:t>
+      </w:r>
+    </w:p>
+    <w:p>
+      <w:pPr>
+        <w:rPr>
+          <w:b/>
+          <w:bCs/>
+        </w:rPr>
+      </w:pPr>
+      <w:r>
+        <w:rPr>
+          <w:b/>
+          <w:bCs/>
+        </w:rPr>
+        <w:lastRenderedPageBreak/>
+        <w:drawing>
+          <wp:inline distT="0" distB="0" distL="0" distR="0" wp14:anchorId="591BF1E2" wp14:editId="0CD3EBCD">
+            <wp:extent cx="5796170" cy="5732388"/>
+            <wp:effectExtent l="0" t="0" r="0" b="1905"/>
+            <wp:docPr id="100310169" name="Picture 1"/>
+            <wp:cNvGraphicFramePr>
+              <a:graphicFrameLocks xmlns:a="http://schemas.openxmlformats.org/drawingml/2006/main" noChangeAspect="1"/>
+            </wp:cNvGraphicFramePr>
+            <a:graphic xmlns:a="http://schemas.openxmlformats.org/drawingml/2006/main">
+              <a:graphicData uri="http://schemas.openxmlformats.org/drawingml/2006/picture">
+                <pic:pic xmlns:pic="http://schemas.openxmlformats.org/drawingml/2006/picture">
+                  <pic:nvPicPr>
+                    <pic:cNvPr id="100310169" name=""/>
+                    <pic:cNvPicPr/>
+                  </pic:nvPicPr>
+                  <pic:blipFill>
+                    <a:blip r:embed="rId37"/>
+                    <a:stretch>
+                      <a:fillRect/>
+                    </a:stretch>
+                  </pic:blipFill>
+                  <pic:spPr>
+                    <a:xfrm>
+                      <a:off x="0" y="0"/>
+                      <a:ext cx="5812195" cy="5748237"/>
+                    </a:xfrm>
+                    <a:prstGeom prst="rect">
+                      <a:avLst/>
+                    </a:prstGeom>
+                  </pic:spPr>
+                </pic:pic>
+              </a:graphicData>
+            </a:graphic>
+          </wp:inline>
+        </w:drawing>
+      </w:r>
+    </w:p>
+    <w:p>
+      <w:pPr>
+        <w:rPr>
+          <w:b/>
+          <w:bCs/>
+        </w:rPr>
+      </w:pPr>
+      <w:r>
+        <w:rPr>
+          <w:b/>
+          <w:bCs/>
+        </w:rPr>
+        <w:lastRenderedPageBreak/>
+        <w:drawing>
+          <wp:inline distT="0" distB="0" distL="0" distR="0" wp14:anchorId="2E384240" wp14:editId="67B7C9B5">
+            <wp:extent cx="5645426" cy="5417439"/>
+            <wp:effectExtent l="0" t="0" r="0" b="0"/>
+            <wp:docPr id="243004368" name="Picture 1"/>
+            <wp:cNvGraphicFramePr>
+              <a:graphicFrameLocks xmlns:a="http://schemas.openxmlformats.org/drawingml/2006/main" noChangeAspect="1"/>
+            </wp:cNvGraphicFramePr>
+            <a:graphic xmlns:a="http://schemas.openxmlformats.org/drawingml/2006/main">
+              <a:graphicData uri="http://schemas.openxmlformats.org/drawingml/2006/picture">
+                <pic:pic xmlns:pic="http://schemas.openxmlformats.org/drawingml/2006/picture">
+                  <pic:nvPicPr>
+                    <pic:cNvPr id="243004368" name=""/>
+                    <pic:cNvPicPr/>
+                  </pic:nvPicPr>
+                  <pic:blipFill>
+                    <a:blip r:embed="rId38"/>
+                    <a:stretch>
+                      <a:fillRect/>
+                    </a:stretch>
+                  </pic:blipFill>
+                  <pic:spPr>
+                    <a:xfrm>
+                      <a:off x="0" y="0"/>
+                      <a:ext cx="5652327" cy="5424062"/>
+                    </a:xfrm>
+                    <a:prstGeom prst="rect">
+                      <a:avLst/>
+                    </a:prstGeom>
+                  </pic:spPr>
+                </pic:pic>
+              </a:graphicData>
+            </a:graphic>
+          </wp:inline>
+        </w:drawing>
+      </w:r>
+    </w:p>
+    <w:p>
+      <w:pPr>
+        <w:rPr>
+          <w:b/>
+          <w:bCs/>
+        </w:rPr>
+      </w:pPr>
+      <w:r>
+        <w:rPr>
+          <w:b/>
+          <w:bCs/>
+        </w:rPr>
+        <w:lastRenderedPageBreak/>
+        <w:drawing>
+          <wp:inline distT="0" distB="0" distL="0" distR="0" wp14:anchorId="77A2FF85" wp14:editId="4EBC16C7">
+            <wp:extent cx="5438692" cy="4369548"/>
+            <wp:effectExtent l="0" t="0" r="0" b="0"/>
+            <wp:docPr id="381095988" name="Picture 1"/>
+            <wp:cNvGraphicFramePr>
+              <a:graphicFrameLocks xmlns:a="http://schemas.openxmlformats.org/drawingml/2006/main" noChangeAspect="1"/>
+            </wp:cNvGraphicFramePr>
+            <a:graphic xmlns:a="http://schemas.openxmlformats.org/drawingml/2006/main">
+              <a:graphicData uri="http://schemas.openxmlformats.org/drawingml/2006/picture">
+                <pic:pic xmlns:pic="http://schemas.openxmlformats.org/drawingml/2006/picture">
+                  <pic:nvPicPr>
+                    <pic:cNvPr id="381095988" name=""/>
+                    <pic:cNvPicPr/>
+                  </pic:nvPicPr>
+                  <pic:blipFill>
+                    <a:blip r:embed="rId39"/>
+                    <a:stretch>
+                      <a:fillRect/>
+                    </a:stretch>
+                  </pic:blipFill>
+                  <pic:spPr>
+                    <a:xfrm>
+                      <a:off x="0" y="0"/>
+                      <a:ext cx="5444515" cy="4374226"/>
+                    </a:xfrm>
+                    <a:prstGeom prst="rect">
+                      <a:avLst/>
+                    </a:prstGeom>
+                  </pic:spPr>
+                </pic:pic>
+              </a:graphicData>
+            </a:graphic>
+          </wp:inline>
+        </w:drawing>
+      </w:r>
+    </w:p>
+    <w:p>
+      <w:pPr>
+        <w:pStyle w:val="ListParagraph"/>
+        <w:numPr>
+          <w:ilvl w:val="0"/>
+          <w:numId w:val="4"/>
+        </w:numPr>
+        <w:rPr>
+          <w:b/>
+          <w:bCs/>
+        </w:rPr>
+      </w:pPr>
+      <w:r>
+        <w:rPr>
+          <w:b/>
+          <w:bCs/>
+        </w:rPr>
+        <w:t>Đây là quan hệ 1-1</w:t>
+      </w:r>
+    </w:p>
+    <w:p>
+      <w:pPr>
+        <w:rPr>
+          <w:b/>
+          <w:bCs/>
+        </w:rPr>
+      </w:pPr>
+      <w:r>
+        <w:rPr>
+          <w:b/>
+          <w:bCs/>
+        </w:rPr>
+        <w:br w:type="page"/>
+      </w:r>
+    </w:p>
+    <w:p>
+      <w:pPr>
+        <w:jc w:val="center"/>
+        <w:rPr>
+          <w:b/>
+          <w:bCs/>
+          <w:sz w:val="32"/>
+          <w:szCs w:val="32"/>
+        </w:rPr>
+      </w:pPr>
+      <w:r>
+        <w:rPr>
+          <w:b/>
+          <w:bCs/>
+          <w:sz w:val="32"/>
+          <w:szCs w:val="32"/>
+        </w:rPr>
+        <w:lastRenderedPageBreak/>
+        <w:t>[ForeignKey]</w:t>
+      </w:r>
+    </w:p>
+    <w:p>
+      <w:pPr>
+        <w:jc w:val="center"/>
+        <w:rPr>
+          <w:b/>
+          <w:bCs/>
+          <w:sz w:val="32"/>
+          <w:szCs w:val="32"/>
+        </w:rPr>
+      </w:pPr>
+      <w:r>
+        <w:rPr>
+          <w:b/>
+          <w:bCs/>
+          <w:sz w:val="32"/>
+          <w:szCs w:val="32"/>
+        </w:rPr>
+        <w:drawing>
+          <wp:inline distT="0" distB="0" distL="0" distR="0" wp14:anchorId="0135AAB6" wp14:editId="2785B12C">
+            <wp:extent cx="5221544" cy="4550999"/>
+            <wp:effectExtent l="0" t="0" r="0" b="2540"/>
+            <wp:docPr id="594745861" name="Picture 1"/>
+            <wp:cNvGraphicFramePr>
+              <a:graphicFrameLocks xmlns:a="http://schemas.openxmlformats.org/drawingml/2006/main" noChangeAspect="1"/>
+            </wp:cNvGraphicFramePr>
+            <a:graphic xmlns:a="http://schemas.openxmlformats.org/drawingml/2006/main">
+              <a:graphicData uri="http://schemas.openxmlformats.org/drawingml/2006/picture">
+                <pic:pic xmlns:pic="http://schemas.openxmlformats.org/drawingml/2006/picture">
+                  <pic:nvPicPr>
+                    <pic:cNvPr id="594745861" name=""/>
+                    <pic:cNvPicPr/>
+                  </pic:nvPicPr>
+                  <pic:blipFill>
+                    <a:blip r:embed="rId40"/>
+                    <a:stretch>
+                      <a:fillRect/>
+                    </a:stretch>
+                  </pic:blipFill>
+                  <pic:spPr>
+                    <a:xfrm>
+                      <a:off x="0" y="0"/>
+                      <a:ext cx="5234501" cy="4562292"/>
+                    </a:xfrm>
+                    <a:prstGeom prst="rect">
+                      <a:avLst/>
+                    </a:prstGeom>
+                  </pic:spPr>
+                </pic:pic>
+              </a:graphicData>
+            </a:graphic>
+          </wp:inline>
+        </w:drawing>
+      </w:r>
+    </w:p>
+    <w:p>
+      <w:pPr>
+        <w:jc w:val="center"/>
+        <w:rPr>
+          <w:b/>
+          <w:bCs/>
+          <w:sz w:val="32"/>
+          <w:szCs w:val="32"/>
+        </w:rPr>
+      </w:pPr>
+      <w:r>
+        <w:rPr>
+          <w:b/>
+          <w:bCs/>
+          <w:sz w:val="32"/>
+          <w:szCs w:val="32"/>
+        </w:rPr>
+        <w:lastRenderedPageBreak/>
+        <w:drawing>
+          <wp:inline distT="0" distB="0" distL="0" distR="0" wp14:anchorId="0BAC8F91" wp14:editId="446514CD">
+            <wp:extent cx="4913906" cy="4176820"/>
+            <wp:effectExtent l="0" t="0" r="1270" b="0"/>
+            <wp:docPr id="1317973840" name="Picture 1"/>
+            <wp:cNvGraphicFramePr>
+              <a:graphicFrameLocks xmlns:a="http://schemas.openxmlformats.org/drawingml/2006/main" noChangeAspect="1"/>
+            </wp:cNvGraphicFramePr>
+            <a:graphic xmlns:a="http://schemas.openxmlformats.org/drawingml/2006/main">
+              <a:graphicData uri="http://schemas.openxmlformats.org/drawingml/2006/picture">
+                <pic:pic xmlns:pic="http://schemas.openxmlformats.org/drawingml/2006/picture">
+                  <pic:nvPicPr>
+                    <pic:cNvPr id="1317973840" name=""/>
+                    <pic:cNvPicPr/>
+                  </pic:nvPicPr>
+                  <pic:blipFill>
+                    <a:blip r:embed="rId41"/>
+                    <a:stretch>
+                      <a:fillRect/>
+                    </a:stretch>
+                  </pic:blipFill>
+                  <pic:spPr>
+                    <a:xfrm>
+                      <a:off x="0" y="0"/>
+                      <a:ext cx="4916366" cy="4178911"/>
+                    </a:xfrm>
+                    <a:prstGeom prst="rect">
+                      <a:avLst/>
+                    </a:prstGeom>
+                  </pic:spPr>
+                </pic:pic>
+              </a:graphicData>
+            </a:graphic>
+          </wp:inline>
+        </w:drawing>
+      </w:r>
+    </w:p>
     <w:sectPr>
       <w:pgSz w:w="12240" w:h="15840"/>
       <w:pgMar w:top="1440" w:right="1440" w:bottom="1440" w:left="1440" w:header="720" w:footer="720" w:gutter="0"/>
@@ -5248,6 +6265,118 @@
     </w:lvl>
   </w:abstractNum>
   <w:abstractNum w:abstractNumId="1" w15:restartNumberingAfterBreak="0">
+    <w:nsid w:val="12E640D7"/>
+    <w:multiLevelType w:val="hybridMultilevel"/>
+    <w:tmpl w:val="79C04D2A"/>
+    <w:lvl w:ilvl="0" w:tplc="3B964774">
+      <w:numFmt w:val="bullet"/>
+      <w:lvlText w:val=""/>
+      <w:lvlJc w:val="left"/>
+      <w:pPr>
+        <w:ind w:left="720" w:hanging="360"/>
+      </w:pPr>
+      <w:rPr>
+        <w:rFonts w:ascii="Wingdings" w:eastAsiaTheme="minorHAnsi" w:hAnsi="Wingdings" w:cstheme="minorBidi" w:hint="default"/>
+      </w:rPr>
+    </w:lvl>
+    <w:lvl w:ilvl="1" w:tplc="04090003" w:tentative="1">
+      <w:start w:val="1"/>
+      <w:numFmt w:val="bullet"/>
+      <w:lvlText w:val="o"/>
+      <w:lvlJc w:val="left"/>
+      <w:pPr>
+        <w:ind w:left="1440" w:hanging="360"/>
+      </w:pPr>
+      <w:rPr>
+        <w:rFonts w:ascii="Courier New" w:hAnsi="Courier New" w:cs="Courier New" w:hint="default"/>
+      </w:rPr>
+    </w:lvl>
+    <w:lvl w:ilvl="2" w:tplc="04090005" w:tentative="1">
+      <w:start w:val="1"/>
+      <w:numFmt w:val="bullet"/>
+      <w:lvlText w:val=""/>
+      <w:lvlJc w:val="left"/>
+      <w:pPr>
+        <w:ind w:left="2160" w:hanging="360"/>
+      </w:pPr>
+      <w:rPr>
+        <w:rFonts w:ascii="Wingdings" w:hAnsi="Wingdings" w:hint="default"/>
+      </w:rPr>
+    </w:lvl>
+    <w:lvl w:ilvl="3" w:tplc="04090001" w:tentative="1">
+      <w:start w:val="1"/>
+      <w:numFmt w:val="bullet"/>
+      <w:lvlText w:val=""/>
+      <w:lvlJc w:val="left"/>
+      <w:pPr>
+        <w:ind w:left="2880" w:hanging="360"/>
+      </w:pPr>
+      <w:rPr>
+        <w:rFonts w:ascii="Symbol" w:hAnsi="Symbol" w:hint="default"/>
+      </w:rPr>
+    </w:lvl>
+    <w:lvl w:ilvl="4" w:tplc="04090003" w:tentative="1">
+      <w:start w:val="1"/>
+      <w:numFmt w:val="bullet"/>
+      <w:lvlText w:val="o"/>
+      <w:lvlJc w:val="left"/>
+      <w:pPr>
+        <w:ind w:left="3600" w:hanging="360"/>
+      </w:pPr>
+      <w:rPr>
+        <w:rFonts w:ascii="Courier New" w:hAnsi="Courier New" w:cs="Courier New" w:hint="default"/>
+      </w:rPr>
+    </w:lvl>
+    <w:lvl w:ilvl="5" w:tplc="04090005" w:tentative="1">
+      <w:start w:val="1"/>
+      <w:numFmt w:val="bullet"/>
+      <w:lvlText w:val=""/>
+      <w:lvlJc w:val="left"/>
+      <w:pPr>
+        <w:ind w:left="4320" w:hanging="360"/>
+      </w:pPr>
+      <w:rPr>
+        <w:rFonts w:ascii="Wingdings" w:hAnsi="Wingdings" w:hint="default"/>
+      </w:rPr>
+    </w:lvl>
+    <w:lvl w:ilvl="6" w:tplc="04090001" w:tentative="1">
+      <w:start w:val="1"/>
+      <w:numFmt w:val="bullet"/>
+      <w:lvlText w:val=""/>
+      <w:lvlJc w:val="left"/>
+      <w:pPr>
+        <w:ind w:left="5040" w:hanging="360"/>
+      </w:pPr>
+      <w:rPr>
+        <w:rFonts w:ascii="Symbol" w:hAnsi="Symbol" w:hint="default"/>
+      </w:rPr>
+    </w:lvl>
+    <w:lvl w:ilvl="7" w:tplc="04090003" w:tentative="1">
+      <w:start w:val="1"/>
+      <w:numFmt w:val="bullet"/>
+      <w:lvlText w:val="o"/>
+      <w:lvlJc w:val="left"/>
+      <w:pPr>
+        <w:ind w:left="5760" w:hanging="360"/>
+      </w:pPr>
+      <w:rPr>
+        <w:rFonts w:ascii="Courier New" w:hAnsi="Courier New" w:cs="Courier New" w:hint="default"/>
+      </w:rPr>
+    </w:lvl>
+    <w:lvl w:ilvl="8" w:tplc="04090005" w:tentative="1">
+      <w:start w:val="1"/>
+      <w:numFmt w:val="bullet"/>
+      <w:lvlText w:val=""/>
+      <w:lvlJc w:val="left"/>
+      <w:pPr>
+        <w:ind w:left="6480" w:hanging="360"/>
+      </w:pPr>
+      <w:rPr>
+        <w:rFonts w:ascii="Wingdings" w:hAnsi="Wingdings" w:hint="default"/>
+      </w:rPr>
+    </w:lvl>
+  </w:abstractNum>
+  <w:abstractNum w:abstractNumId="2" w15:restartNumberingAfterBreak="0">
     <w:nsid w:val="3A48159F"/>
     <w:multiLevelType w:val="multilevel"/>
     <w:tmpl w:val="3BC43E3E"/>
@@ -5396,7 +6525,7 @@
       </w:rPr>
     </w:lvl>
   </w:abstractNum>
-  <w:abstractNum w:abstractNumId="2" w15:restartNumberingAfterBreak="0">
+  <w:abstractNum w:abstractNumId="3" w15:restartNumberingAfterBreak="0">
     <w:nsid w:val="73B52B43"/>
     <w:multiLevelType w:val="multilevel"/>
     <w:tmpl w:val="59884D7E"/>
@@ -5514,12 +6643,15 @@
     </w:lvl>
   </w:abstractNum>
   <w:num w:numId="1" w16cid:durableId="430272983">
-    <w:abstractNumId w:val="2"/>
+    <w:abstractNumId w:val="3"/>
   </w:num>
   <w:num w:numId="2" w16cid:durableId="301925985">
     <w:abstractNumId w:val="0"/>
   </w:num>
   <w:num w:numId="3" w16cid:durableId="553927071">
+    <w:abstractNumId w:val="2"/>
+  </w:num>
+  <w:num w:numId="4" w16cid:durableId="1953439933">
     <w:abstractNumId w:val="1"/>
   </w:num>
 </w:numbering>

</xml_diff>